<commit_message>
Diseño Web Eval 1: - Se actualizó el informe a su etapa final. - Se agregó una imagen del logo del emprendedor al header. - Se actualizó la sección de stock por fotos de stock real.
</commit_message>
<xml_diff>
--- a/Informe de Reunión Evaluación 1.docx
+++ b/Informe de Reunión Evaluación 1.docx
@@ -1,6 +1,6 @@
 
 <file path=word/document.xml><?xml version="1.0" encoding="utf-8"?>
-<w:document xmlns:wpc="http://schemas.microsoft.com/office/word/2010/wordprocessingCanvas" xmlns:cx="http://schemas.microsoft.com/office/drawing/2014/chartex" xmlns:cx1="http://schemas.microsoft.com/office/drawing/2015/9/8/chartex" xmlns:cx2="http://schemas.microsoft.com/office/drawing/2015/10/21/chartex" xmlns:cx3="http://schemas.microsoft.com/office/drawing/2016/5/9/chartex" xmlns:cx4="http://schemas.microsoft.com/office/drawing/2016/5/10/chartex" xmlns:cx5="http://schemas.microsoft.com/office/drawing/2016/5/11/chartex" xmlns:cx6="http://schemas.microsoft.com/office/drawing/2016/5/12/chartex" xmlns:cx7="http://schemas.microsoft.com/office/drawing/2016/5/13/chartex" xmlns:cx8="http://schemas.microsoft.com/office/drawing/2016/5/14/chartex" xmlns:mc="http://schemas.openxmlformats.org/markup-compatibility/2006" xmlns:aink="http://schemas.microsoft.com/office/drawing/2016/ink" xmlns:am3d="http://schemas.microsoft.com/office/drawing/2017/model3d" xmlns:o="urn:schemas-microsoft-com:office:office" xmlns:oel="http://schemas.microsoft.com/office/2019/extlst" xmlns:r="http://schemas.openxmlformats.org/officeDocument/2006/relationships" xmlns:m="http://schemas.openxmlformats.org/officeDocument/2006/math" xmlns:v="urn:schemas-microsoft-com:vml" xmlns:wp14="http://schemas.microsoft.com/office/word/2010/wordprocessingDrawing" xmlns:wp="http://schemas.openxmlformats.org/drawingml/2006/wordprocessingDrawing" xmlns:w10="urn:schemas-microsoft-com:office:word" xmlns:w="http://schemas.openxmlformats.org/wordprocessingml/2006/main" xmlns:w14="http://schemas.microsoft.com/office/word/2010/wordml" xmlns:w15="http://schemas.microsoft.com/office/word/2012/wordml" xmlns:w16cex="http://schemas.microsoft.com/office/word/2018/wordml/cex" xmlns:w16cid="http://schemas.microsoft.com/office/word/2016/wordml/cid" xmlns:w16="http://schemas.microsoft.com/office/word/2018/wordml" xmlns:w16du="http://schemas.microsoft.com/office/word/2023/wordml/word16du" xmlns:w16sdtdh="http://schemas.microsoft.com/office/word/2020/wordml/sdtdatahash" xmlns:w16sdtfl="http://schemas.microsoft.com/office/word/2024/wordml/sdtformatlock" xmlns:w16se="http://schemas.microsoft.com/office/word/2015/wordml/symex" xmlns:wpg="http://schemas.microsoft.com/office/word/2010/wordprocessingGroup" xmlns:wpi="http://schemas.microsoft.com/office/word/2010/wordprocessingInk" xmlns:wne="http://schemas.microsoft.com/office/word/2006/wordml" xmlns:wps="http://schemas.microsoft.com/office/word/2010/wordprocessingShape" mc:Ignorable="w14 w15 w16se w16cid w16 w16cex w16sdtdh w16sdtfl w16du wp14">
+<w:document xmlns:wpc="http://schemas.microsoft.com/office/word/2010/wordprocessingCanvas" xmlns:cx="http://schemas.microsoft.com/office/drawing/2014/chartex" xmlns:cx1="http://schemas.microsoft.com/office/drawing/2015/9/8/chartex" xmlns:cx2="http://schemas.microsoft.com/office/drawing/2015/10/21/chartex" xmlns:cx3="http://schemas.microsoft.com/office/drawing/2016/5/9/chartex" xmlns:cx4="http://schemas.microsoft.com/office/drawing/2016/5/10/chartex" xmlns:cx5="http://schemas.microsoft.com/office/drawing/2016/5/11/chartex" xmlns:cx6="http://schemas.microsoft.com/office/drawing/2016/5/12/chartex" xmlns:cx7="http://schemas.microsoft.com/office/drawing/2016/5/13/chartex" xmlns:cx8="http://schemas.microsoft.com/office/drawing/2016/5/14/chartex" xmlns:mc="http://schemas.openxmlformats.org/markup-compatibility/2006" xmlns:aink="http://schemas.microsoft.com/office/drawing/2016/ink" xmlns:am3d="http://schemas.microsoft.com/office/drawing/2017/model3d" xmlns:o="urn:schemas-microsoft-com:office:office" xmlns:oel="http://schemas.microsoft.com/office/2019/extlst" xmlns:r="http://schemas.openxmlformats.org/officeDocument/2006/relationships" xmlns:m="http://schemas.openxmlformats.org/officeDocument/2006/math" xmlns:v="urn:schemas-microsoft-com:vml" xmlns:wp14="http://schemas.microsoft.com/office/word/2010/wordprocessingDrawing" xmlns:wp="http://schemas.openxmlformats.org/drawingml/2006/wordprocessingDrawing" xmlns:w10="urn:schemas-microsoft-com:office:word" xmlns:w="http://schemas.openxmlformats.org/wordprocessingml/2006/main" xmlns:w14="http://schemas.microsoft.com/office/word/2010/wordml" xmlns:w15="http://schemas.microsoft.com/office/word/2012/wordml" xmlns:w16cex="http://schemas.microsoft.com/office/word/2018/wordml/cex" xmlns:w16cid="http://schemas.microsoft.com/office/word/2016/wordml/cid" xmlns:w16="http://schemas.microsoft.com/office/word/2018/wordml" xmlns:w16sdtdh="http://schemas.microsoft.com/office/word/2020/wordml/sdtdatahash" xmlns:w16se="http://schemas.microsoft.com/office/word/2015/wordml/symex" xmlns:wpg="http://schemas.microsoft.com/office/word/2010/wordprocessingGroup" xmlns:wpi="http://schemas.microsoft.com/office/word/2010/wordprocessingInk" xmlns:wne="http://schemas.microsoft.com/office/word/2006/wordml" xmlns:wps="http://schemas.microsoft.com/office/word/2010/wordprocessingShape" mc:Ignorable="w14 w15 w16se w16cid w16 w16cex w16sdtdh wp14">
   <w:body>
     <w:sdt>
       <w:sdtPr>
@@ -125,7 +125,7 @@
                   </wp:anchor>
                 </w:drawing>
               </mc:Choice>
-              <mc:Fallback>
+              <mc:Fallback xmlns:w16sdtfl="http://schemas.microsoft.com/office/word/2024/wordml/sdtformatlock" xmlns:w16du="http://schemas.microsoft.com/office/word/2023/wordml/word16du">
                 <w:pict>
                   <v:rect w14:anchorId="5109D259" id="Rectángulo 261" o:spid="_x0000_s1026" style="position:absolute;margin-left:0;margin-top:0;width:244.8pt;height:669pt;z-index:251659264;visibility:visible;mso-wrap-style:square;mso-width-percent:400;mso-height-percent:0;mso-left-percent:440;mso-top-percent:25;mso-wrap-distance-left:9pt;mso-wrap-distance-top:0;mso-wrap-distance-right:9pt;mso-wrap-distance-bottom:0;mso-position-horizontal-relative:page;mso-position-vertical-relative:page;mso-width-percent:400;mso-height-percent:0;mso-left-percent:440;mso-top-percent:25;mso-width-relative:page;mso-height-relative:page;v-text-anchor:middle" o:gfxdata="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" fillcolor="white [3212]" strokecolor="#747070 [1614]" strokeweight="1.25pt">
                     <w10:wrap anchorx="page" anchory="page"/>
@@ -718,15 +718,15 @@
             <mc:AlternateContent>
               <mc:Choice Requires="wps">
                 <w:drawing>
-                  <wp:anchor distT="0" distB="0" distL="114300" distR="114300" simplePos="0" relativeHeight="251664384" behindDoc="0" locked="0" layoutInCell="1" allowOverlap="1" wp14:anchorId="454419BC" wp14:editId="689AD1F2">
+                  <wp:anchor distT="0" distB="0" distL="114300" distR="114300" simplePos="0" relativeHeight="251664384" behindDoc="0" locked="0" layoutInCell="1" allowOverlap="1" wp14:anchorId="454419BC" wp14:editId="78C360F7">
                     <wp:simplePos x="0" y="0"/>
                     <wp:positionH relativeFrom="page">
-                      <wp:posOffset>3456940</wp:posOffset>
+                      <wp:posOffset>3459480</wp:posOffset>
                     </wp:positionH>
                     <wp:positionV relativeFrom="page">
-                      <wp:posOffset>6257290</wp:posOffset>
+                      <wp:posOffset>6256020</wp:posOffset>
                     </wp:positionV>
-                    <wp:extent cx="2797810" cy="1343025"/>
+                    <wp:extent cx="2797810" cy="1684020"/>
                     <wp:effectExtent l="0" t="0" r="0" b="0"/>
                     <wp:wrapSquare wrapText="bothSides"/>
                     <wp:docPr id="465" name="Cuadro de texto 255"/>
@@ -738,7 +738,7 @@
                           <wps:spPr>
                             <a:xfrm>
                               <a:off x="0" y="0"/>
-                              <a:ext cx="2797810" cy="1343025"/>
+                              <a:ext cx="2797810" cy="1684020"/>
                             </a:xfrm>
                             <a:prstGeom prst="rect">
                               <a:avLst/>
@@ -753,7 +753,7 @@
                             <w:txbxContent>
                               <w:p>
                                 <w:pPr>
-                                  <w:pStyle w:val="Sinespaciado"/>
+                                  <w:pStyle w:val="NoSpacing"/>
                                   <w:rPr>
                                     <w:b/>
                                     <w:bCs/>
@@ -775,7 +775,7 @@
                               </w:p>
                               <w:p>
                                 <w:pPr>
-                                  <w:pStyle w:val="Sinespaciado"/>
+                                  <w:pStyle w:val="NoSpacing"/>
                                   <w:rPr>
                                     <w:color w:val="44546A" w:themeColor="text2"/>
                                     <w:lang w:val="es-CL"/>
@@ -807,9 +807,10 @@
                               </w:p>
                               <w:p>
                                 <w:pPr>
-                                  <w:pStyle w:val="Sinespaciado"/>
+                                  <w:pStyle w:val="NoSpacing"/>
                                   <w:rPr>
                                     <w:color w:val="44546A" w:themeColor="text2"/>
+                                    <w:lang w:val="es-CL"/>
                                   </w:rPr>
                                 </w:pPr>
                                 <w:r>
@@ -828,6 +829,18 @@
                                   </w:rPr>
                                   <w:t xml:space="preserve">: </w:t>
                                 </w:r>
+                              </w:p>
+                              <w:p>
+                                <w:pPr>
+                                  <w:pStyle w:val="NoSpacing"/>
+                                  <w:numPr>
+                                    <w:ilvl w:val="0"/>
+                                    <w:numId w:val="2"/>
+                                  </w:numPr>
+                                  <w:rPr>
+                                    <w:color w:val="44546A" w:themeColor="text2"/>
+                                  </w:rPr>
+                                </w:pPr>
                                 <w:r>
                                   <w:rPr>
                                     <w:color w:val="44546A" w:themeColor="text2"/>
@@ -842,20 +855,133 @@
                                   </w:rPr>
                                   <w:t xml:space="preserve">Felipe González </w:t>
                                 </w:r>
+                                <w:proofErr w:type="spellStart"/>
                                 <w:r>
                                   <w:rPr>
                                     <w:color w:val="44546A" w:themeColor="text2"/>
                                     <w:lang w:val="es-CL"/>
                                   </w:rPr>
-                                  <w:t>Gallardo, Exequiel Elías Israel Gutiérrez Flores, Camilo Sebastián Hernández Flores, Gabriel Alejandro González Barahona</w:t>
+                                  <w:t>Gallardo</w:t>
+                                </w:r>
+                                <w:proofErr w:type="spellEnd"/>
+                                <w:r>
+                                  <w:rPr>
+                                    <w:color w:val="44546A" w:themeColor="text2"/>
+                                    <w:lang w:val="es-CL"/>
+                                  </w:rPr>
+                                  <w:t>.</w:t>
+                                </w:r>
+                              </w:p>
+                              <w:p>
+                                <w:pPr>
+                                  <w:pStyle w:val="NoSpacing"/>
+                                  <w:numPr>
+                                    <w:ilvl w:val="0"/>
+                                    <w:numId w:val="2"/>
+                                  </w:numPr>
+                                  <w:rPr>
+                                    <w:color w:val="44546A" w:themeColor="text2"/>
+                                  </w:rPr>
+                                </w:pPr>
+                                <w:r>
+                                  <w:rPr>
+                                    <w:color w:val="44546A" w:themeColor="text2"/>
+                                    <w:lang w:val="es-CL"/>
+                                  </w:rPr>
+                                  <w:t>Exequiel Gutiérrez</w:t>
                                 </w:r>
                                 <w:r>
                                   <w:rPr>
                                     <w:color w:val="44546A" w:themeColor="text2"/>
                                     <w:lang w:val="es-CL"/>
                                   </w:rPr>
-                                  <w:t xml:space="preserve">, </w:t>
+                                  <w:t xml:space="preserve"> </w:t>
                                 </w:r>
+                                <w:r>
+                                  <w:rPr>
+                                    <w:color w:val="44546A" w:themeColor="text2"/>
+                                    <w:lang w:val="es-CL"/>
+                                  </w:rPr>
+                                  <w:t>Flores</w:t>
+                                </w:r>
+                                <w:r>
+                                  <w:rPr>
+                                    <w:color w:val="44546A" w:themeColor="text2"/>
+                                    <w:lang w:val="es-CL"/>
+                                  </w:rPr>
+                                  <w:t>.</w:t>
+                                </w:r>
+                              </w:p>
+                              <w:p>
+                                <w:pPr>
+                                  <w:pStyle w:val="NoSpacing"/>
+                                  <w:numPr>
+                                    <w:ilvl w:val="0"/>
+                                    <w:numId w:val="2"/>
+                                  </w:numPr>
+                                  <w:rPr>
+                                    <w:color w:val="44546A" w:themeColor="text2"/>
+                                  </w:rPr>
+                                </w:pPr>
+                                <w:r>
+                                  <w:rPr>
+                                    <w:color w:val="44546A" w:themeColor="text2"/>
+                                    <w:lang w:val="es-CL"/>
+                                  </w:rPr>
+                                  <w:t>Camilo Sebastián Hernández Flores</w:t>
+                                </w:r>
+                                <w:r>
+                                  <w:rPr>
+                                    <w:color w:val="44546A" w:themeColor="text2"/>
+                                    <w:lang w:val="es-CL"/>
+                                  </w:rPr>
+                                  <w:t>.</w:t>
+                                </w:r>
+                              </w:p>
+                              <w:p>
+                                <w:pPr>
+                                  <w:pStyle w:val="NoSpacing"/>
+                                  <w:numPr>
+                                    <w:ilvl w:val="0"/>
+                                    <w:numId w:val="2"/>
+                                  </w:numPr>
+                                  <w:rPr>
+                                    <w:color w:val="44546A" w:themeColor="text2"/>
+                                  </w:rPr>
+                                </w:pPr>
+                                <w:r>
+                                  <w:rPr>
+                                    <w:color w:val="44546A" w:themeColor="text2"/>
+                                    <w:lang w:val="es-CL"/>
+                                  </w:rPr>
+                                  <w:t>Gabriel</w:t>
+                                </w:r>
+                                <w:r>
+                                  <w:rPr>
+                                    <w:color w:val="44546A" w:themeColor="text2"/>
+                                    <w:lang w:val="es-CL"/>
+                                  </w:rPr>
+                                  <w:t xml:space="preserve"> González Barahona</w:t>
+                                </w:r>
+                                <w:r>
+                                  <w:rPr>
+                                    <w:color w:val="44546A" w:themeColor="text2"/>
+                                    <w:lang w:val="es-CL"/>
+                                  </w:rPr>
+                                  <w:t>.</w:t>
+                                </w:r>
+                              </w:p>
+                              <w:p>
+                                <w:pPr>
+                                  <w:pStyle w:val="NoSpacing"/>
+                                  <w:numPr>
+                                    <w:ilvl w:val="0"/>
+                                    <w:numId w:val="2"/>
+                                  </w:numPr>
+                                  <w:rPr>
+                                    <w:color w:val="44546A" w:themeColor="text2"/>
+                                  </w:rPr>
+                                </w:pPr>
                                 <w:r>
                                   <w:rPr>
                                     <w:color w:val="44546A" w:themeColor="text2"/>
@@ -872,7 +998,14 @@
                                   <w:rPr>
                                     <w:color w:val="44546A" w:themeColor="text2"/>
                                   </w:rPr>
-                                  <w:t xml:space="preserve"> J</w:t>
+                                  <w:t xml:space="preserve"> </w:t>
+                                </w:r>
+                                <w:proofErr w:type="spellStart"/>
+                                <w:r>
+                                  <w:rPr>
+                                    <w:color w:val="44546A" w:themeColor="text2"/>
+                                  </w:rPr>
+                                  <w:t>J</w:t>
                                 </w:r>
                                 <w:r>
                                   <w:rPr>
@@ -880,6 +1013,7 @@
                                   </w:rPr>
                                   <w:t>amir</w:t>
                                 </w:r>
+                                <w:proofErr w:type="spellEnd"/>
                                 <w:r>
                                   <w:rPr>
                                     <w:color w:val="44546A" w:themeColor="text2"/>
@@ -902,12 +1036,54 @@
                                   <w:rPr>
                                     <w:color w:val="44546A" w:themeColor="text2"/>
                                   </w:rPr>
-                                  <w:t>ompart.</w:t>
+                                  <w:t>ompart</w:t>
+                                </w:r>
+                                <w:r>
+                                  <w:rPr>
+                                    <w:color w:val="44546A" w:themeColor="text2"/>
+                                  </w:rPr>
+                                  <w:t>.</w:t>
                                 </w:r>
                               </w:p>
                               <w:p>
                                 <w:pPr>
-                                  <w:pStyle w:val="Sinespaciado"/>
+                                  <w:pStyle w:val="NoSpacing"/>
+                                  <w:numPr>
+                                    <w:ilvl w:val="0"/>
+                                    <w:numId w:val="2"/>
+                                  </w:numPr>
+                                  <w:rPr>
+                                    <w:color w:val="44546A" w:themeColor="text2"/>
+                                  </w:rPr>
+                                </w:pPr>
+                                <w:r>
+                                  <w:rPr>
+                                    <w:color w:val="44546A" w:themeColor="text2"/>
+                                  </w:rPr>
+                                  <w:t>Cristian Enrique Gajardo V</w:t>
+                                </w:r>
+                                <w:r>
+                                  <w:rPr>
+                                    <w:color w:val="44546A" w:themeColor="text2"/>
+                                  </w:rPr>
+                                  <w:t>á</w:t>
+                                </w:r>
+                                <w:r>
+                                  <w:rPr>
+                                    <w:color w:val="44546A" w:themeColor="text2"/>
+                                  </w:rPr>
+                                  <w:t>squez</w:t>
+                                </w:r>
+                                <w:r>
+                                  <w:rPr>
+                                    <w:color w:val="44546A" w:themeColor="text2"/>
+                                  </w:rPr>
+                                  <w:t>.</w:t>
+                                </w:r>
+                              </w:p>
+                              <w:p>
+                                <w:pPr>
+                                  <w:pStyle w:val="NoSpacing"/>
                                   <w:rPr>
                                     <w:color w:val="44546A" w:themeColor="text2"/>
                                     <w:lang w:val="es-CL"/>
@@ -943,12 +1119,12 @@
               </mc:Choice>
               <mc:Fallback>
                 <w:pict>
-                  <v:shape w14:anchorId="454419BC" id="Cuadro de texto 255" o:spid="_x0000_s1029" type="#_x0000_t202" style="position:absolute;margin-left:272.2pt;margin-top:492.7pt;width:220.3pt;height:105.75pt;z-index:251664384;visibility:visible;mso-wrap-style:square;mso-width-percent:360;mso-height-percent:0;mso-wrap-distance-left:9pt;mso-wrap-distance-top:0;mso-wrap-distance-right:9pt;mso-wrap-distance-bottom:0;mso-position-horizontal:absolute;mso-position-horizontal-relative:page;mso-position-vertical:absolute;mso-position-vertical-relative:page;mso-width-percent:360;mso-height-percent:0;mso-width-relative:page;mso-height-relative:margin;v-text-anchor:bottom" o:gfxdata="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" filled="f" stroked="f" strokeweight=".5pt">
+                  <v:shape w14:anchorId="454419BC" id="Cuadro de texto 255" o:spid="_x0000_s1029" type="#_x0000_t202" style="position:absolute;margin-left:272.4pt;margin-top:492.6pt;width:220.3pt;height:132.6pt;z-index:251664384;visibility:visible;mso-wrap-style:square;mso-width-percent:360;mso-height-percent:0;mso-wrap-distance-left:9pt;mso-wrap-distance-top:0;mso-wrap-distance-right:9pt;mso-wrap-distance-bottom:0;mso-position-horizontal:absolute;mso-position-horizontal-relative:page;mso-position-vertical:absolute;mso-position-vertical-relative:page;mso-width-percent:360;mso-height-percent:0;mso-width-relative:page;mso-height-relative:margin;v-text-anchor:bottom" o:gfxdata="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" filled="f" stroked="f" strokeweight=".5pt">
                     <v:textbox>
                       <w:txbxContent>
                         <w:p>
                           <w:pPr>
-                            <w:pStyle w:val="Sinespaciado"/>
+                            <w:pStyle w:val="NoSpacing"/>
                             <w:rPr>
                               <w:b/>
                               <w:bCs/>
@@ -970,7 +1146,7 @@
                         </w:p>
                         <w:p>
                           <w:pPr>
-                            <w:pStyle w:val="Sinespaciado"/>
+                            <w:pStyle w:val="NoSpacing"/>
                             <w:rPr>
                               <w:color w:val="44546A" w:themeColor="text2"/>
                               <w:lang w:val="es-CL"/>
@@ -1002,9 +1178,10 @@
                         </w:p>
                         <w:p>
                           <w:pPr>
-                            <w:pStyle w:val="Sinespaciado"/>
+                            <w:pStyle w:val="NoSpacing"/>
                             <w:rPr>
                               <w:color w:val="44546A" w:themeColor="text2"/>
+                              <w:lang w:val="es-CL"/>
                             </w:rPr>
                           </w:pPr>
                           <w:r>
@@ -1023,6 +1200,18 @@
                             </w:rPr>
                             <w:t xml:space="preserve">: </w:t>
                           </w:r>
+                        </w:p>
+                        <w:p>
+                          <w:pPr>
+                            <w:pStyle w:val="NoSpacing"/>
+                            <w:numPr>
+                              <w:ilvl w:val="0"/>
+                              <w:numId w:val="2"/>
+                            </w:numPr>
+                            <w:rPr>
+                              <w:color w:val="44546A" w:themeColor="text2"/>
+                            </w:rPr>
+                          </w:pPr>
                           <w:r>
                             <w:rPr>
                               <w:color w:val="44546A" w:themeColor="text2"/>
@@ -1037,20 +1226,133 @@
                             </w:rPr>
                             <w:t xml:space="preserve">Felipe González </w:t>
                           </w:r>
+                          <w:proofErr w:type="spellStart"/>
                           <w:r>
                             <w:rPr>
                               <w:color w:val="44546A" w:themeColor="text2"/>
                               <w:lang w:val="es-CL"/>
                             </w:rPr>
-                            <w:t>Gallardo, Exequiel Elías Israel Gutiérrez Flores, Camilo Sebastián Hernández Flores, Gabriel Alejandro González Barahona</w:t>
+                            <w:t>Gallardo</w:t>
+                          </w:r>
+                          <w:proofErr w:type="spellEnd"/>
+                          <w:r>
+                            <w:rPr>
+                              <w:color w:val="44546A" w:themeColor="text2"/>
+                              <w:lang w:val="es-CL"/>
+                            </w:rPr>
+                            <w:t>.</w:t>
+                          </w:r>
+                        </w:p>
+                        <w:p>
+                          <w:pPr>
+                            <w:pStyle w:val="NoSpacing"/>
+                            <w:numPr>
+                              <w:ilvl w:val="0"/>
+                              <w:numId w:val="2"/>
+                            </w:numPr>
+                            <w:rPr>
+                              <w:color w:val="44546A" w:themeColor="text2"/>
+                            </w:rPr>
+                          </w:pPr>
+                          <w:r>
+                            <w:rPr>
+                              <w:color w:val="44546A" w:themeColor="text2"/>
+                              <w:lang w:val="es-CL"/>
+                            </w:rPr>
+                            <w:t>Exequiel Gutiérrez</w:t>
                           </w:r>
                           <w:r>
                             <w:rPr>
                               <w:color w:val="44546A" w:themeColor="text2"/>
                               <w:lang w:val="es-CL"/>
                             </w:rPr>
-                            <w:t xml:space="preserve">, </w:t>
+                            <w:t xml:space="preserve"> </w:t>
                           </w:r>
+                          <w:r>
+                            <w:rPr>
+                              <w:color w:val="44546A" w:themeColor="text2"/>
+                              <w:lang w:val="es-CL"/>
+                            </w:rPr>
+                            <w:t>Flores</w:t>
+                          </w:r>
+                          <w:r>
+                            <w:rPr>
+                              <w:color w:val="44546A" w:themeColor="text2"/>
+                              <w:lang w:val="es-CL"/>
+                            </w:rPr>
+                            <w:t>.</w:t>
+                          </w:r>
+                        </w:p>
+                        <w:p>
+                          <w:pPr>
+                            <w:pStyle w:val="NoSpacing"/>
+                            <w:numPr>
+                              <w:ilvl w:val="0"/>
+                              <w:numId w:val="2"/>
+                            </w:numPr>
+                            <w:rPr>
+                              <w:color w:val="44546A" w:themeColor="text2"/>
+                            </w:rPr>
+                          </w:pPr>
+                          <w:r>
+                            <w:rPr>
+                              <w:color w:val="44546A" w:themeColor="text2"/>
+                              <w:lang w:val="es-CL"/>
+                            </w:rPr>
+                            <w:t>Camilo Sebastián Hernández Flores</w:t>
+                          </w:r>
+                          <w:r>
+                            <w:rPr>
+                              <w:color w:val="44546A" w:themeColor="text2"/>
+                              <w:lang w:val="es-CL"/>
+                            </w:rPr>
+                            <w:t>.</w:t>
+                          </w:r>
+                        </w:p>
+                        <w:p>
+                          <w:pPr>
+                            <w:pStyle w:val="NoSpacing"/>
+                            <w:numPr>
+                              <w:ilvl w:val="0"/>
+                              <w:numId w:val="2"/>
+                            </w:numPr>
+                            <w:rPr>
+                              <w:color w:val="44546A" w:themeColor="text2"/>
+                            </w:rPr>
+                          </w:pPr>
+                          <w:r>
+                            <w:rPr>
+                              <w:color w:val="44546A" w:themeColor="text2"/>
+                              <w:lang w:val="es-CL"/>
+                            </w:rPr>
+                            <w:t>Gabriel</w:t>
+                          </w:r>
+                          <w:r>
+                            <w:rPr>
+                              <w:color w:val="44546A" w:themeColor="text2"/>
+                              <w:lang w:val="es-CL"/>
+                            </w:rPr>
+                            <w:t xml:space="preserve"> González Barahona</w:t>
+                          </w:r>
+                          <w:r>
+                            <w:rPr>
+                              <w:color w:val="44546A" w:themeColor="text2"/>
+                              <w:lang w:val="es-CL"/>
+                            </w:rPr>
+                            <w:t>.</w:t>
+                          </w:r>
+                        </w:p>
+                        <w:p>
+                          <w:pPr>
+                            <w:pStyle w:val="NoSpacing"/>
+                            <w:numPr>
+                              <w:ilvl w:val="0"/>
+                              <w:numId w:val="2"/>
+                            </w:numPr>
+                            <w:rPr>
+                              <w:color w:val="44546A" w:themeColor="text2"/>
+                            </w:rPr>
+                          </w:pPr>
                           <w:r>
                             <w:rPr>
                               <w:color w:val="44546A" w:themeColor="text2"/>
@@ -1067,7 +1369,14 @@
                             <w:rPr>
                               <w:color w:val="44546A" w:themeColor="text2"/>
                             </w:rPr>
-                            <w:t xml:space="preserve"> J</w:t>
+                            <w:t xml:space="preserve"> </w:t>
+                          </w:r>
+                          <w:proofErr w:type="spellStart"/>
+                          <w:r>
+                            <w:rPr>
+                              <w:color w:val="44546A" w:themeColor="text2"/>
+                            </w:rPr>
+                            <w:t>J</w:t>
                           </w:r>
                           <w:r>
                             <w:rPr>
@@ -1075,6 +1384,7 @@
                             </w:rPr>
                             <w:t>amir</w:t>
                           </w:r>
+                          <w:proofErr w:type="spellEnd"/>
                           <w:r>
                             <w:rPr>
                               <w:color w:val="44546A" w:themeColor="text2"/>
@@ -1097,12 +1407,54 @@
                             <w:rPr>
                               <w:color w:val="44546A" w:themeColor="text2"/>
                             </w:rPr>
-                            <w:t>ompart.</w:t>
+                            <w:t>ompart</w:t>
+                          </w:r>
+                          <w:r>
+                            <w:rPr>
+                              <w:color w:val="44546A" w:themeColor="text2"/>
+                            </w:rPr>
+                            <w:t>.</w:t>
                           </w:r>
                         </w:p>
                         <w:p>
                           <w:pPr>
-                            <w:pStyle w:val="Sinespaciado"/>
+                            <w:pStyle w:val="NoSpacing"/>
+                            <w:numPr>
+                              <w:ilvl w:val="0"/>
+                              <w:numId w:val="2"/>
+                            </w:numPr>
+                            <w:rPr>
+                              <w:color w:val="44546A" w:themeColor="text2"/>
+                            </w:rPr>
+                          </w:pPr>
+                          <w:r>
+                            <w:rPr>
+                              <w:color w:val="44546A" w:themeColor="text2"/>
+                            </w:rPr>
+                            <w:t>Cristian Enrique Gajardo V</w:t>
+                          </w:r>
+                          <w:r>
+                            <w:rPr>
+                              <w:color w:val="44546A" w:themeColor="text2"/>
+                            </w:rPr>
+                            <w:t>á</w:t>
+                          </w:r>
+                          <w:r>
+                            <w:rPr>
+                              <w:color w:val="44546A" w:themeColor="text2"/>
+                            </w:rPr>
+                            <w:t>squez</w:t>
+                          </w:r>
+                          <w:r>
+                            <w:rPr>
+                              <w:color w:val="44546A" w:themeColor="text2"/>
+                            </w:rPr>
+                            <w:t>.</w:t>
+                          </w:r>
+                        </w:p>
+                        <w:p>
+                          <w:pPr>
+                            <w:pStyle w:val="NoSpacing"/>
                             <w:rPr>
                               <w:color w:val="44546A" w:themeColor="text2"/>
                               <w:lang w:val="es-CL"/>
@@ -1197,7 +1549,7 @@
                   </wp:anchor>
                 </w:drawing>
               </mc:Choice>
-              <mc:Fallback>
+              <mc:Fallback xmlns:w16sdtfl="http://schemas.microsoft.com/office/word/2024/wordml/sdtformatlock" xmlns:w16du="http://schemas.microsoft.com/office/word/2023/wordml/word16du">
                 <w:pict>
                   <v:rect w14:anchorId="0759018C" id="Rectángulo 263" o:spid="_x0000_s1026" style="position:absolute;margin-left:271.6pt;margin-top:670.15pt;width:226.45pt;height:9.35pt;z-index:251662336;visibility:visible;mso-wrap-style:square;mso-width-percent:370;mso-height-percent:0;mso-wrap-distance-left:9pt;mso-wrap-distance-top:0;mso-wrap-distance-right:9pt;mso-wrap-distance-bottom:0;mso-position-horizontal:absolute;mso-position-horizontal-relative:page;mso-position-vertical:absolute;mso-position-vertical-relative:page;mso-width-percent:370;mso-height-percent:0;mso-width-relative:page;mso-height-relative:margin;v-text-anchor:middle" o:gfxdata="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" fillcolor="#4472c4 [3204]" stroked="f" strokeweight="1pt">
                     <w10:wrap anchorx="page" anchory="page"/>
@@ -1214,7 +1566,7 @@
     </w:sdt>
     <w:p>
       <w:pPr>
-        <w:pStyle w:val="Ttulo1"/>
+        <w:pStyle w:val="Heading1"/>
         <w:jc w:val="center"/>
         <w:rPr>
           <w:rFonts w:ascii="Arial" w:hAnsi="Arial" w:cs="Arial"/>
@@ -1231,6 +1583,7 @@
     <w:p>
       <w:pPr>
         <w:spacing w:after="120" w:line="360" w:lineRule="auto"/>
+        <w:jc w:val="both"/>
         <w:rPr>
           <w:rFonts w:ascii="Arial" w:hAnsi="Arial" w:cs="Arial"/>
           <w:sz w:val="24"/>
@@ -1253,7 +1606,8 @@
     </w:p>
     <w:p>
       <w:pPr>
-        <w:pStyle w:val="Ttulo1"/>
+        <w:pStyle w:val="Heading1"/>
+        <w:jc w:val="center"/>
         <w:rPr>
           <w:rFonts w:ascii="Arial" w:hAnsi="Arial" w:cs="Arial"/>
         </w:rPr>
@@ -1276,7 +1630,7 @@
     </w:p>
     <w:p>
       <w:pPr>
-        <w:pStyle w:val="Ttulo2"/>
+        <w:pStyle w:val="Heading2"/>
         <w:rPr>
           <w:rFonts w:ascii="Arial" w:hAnsi="Arial" w:cs="Arial"/>
         </w:rPr>
@@ -1291,6 +1645,7 @@
     <w:p>
       <w:pPr>
         <w:spacing w:after="120" w:line="360" w:lineRule="auto"/>
+        <w:jc w:val="both"/>
         <w:rPr>
           <w:rFonts w:ascii="Arial" w:hAnsi="Arial" w:cs="Arial"/>
           <w:sz w:val="24"/>
@@ -1319,9 +1674,9 @@
           <w:noProof/>
         </w:rPr>
         <w:drawing>
-          <wp:inline distT="0" distB="0" distL="0" distR="0" wp14:anchorId="1E666A76" wp14:editId="69EC31C9">
+          <wp:inline distT="0" distB="0" distL="0" distR="0" wp14:anchorId="1E666A76" wp14:editId="7509F80B">
             <wp:extent cx="5394960" cy="2468880"/>
-            <wp:effectExtent l="0" t="0" r="0" b="7620"/>
+            <wp:effectExtent l="19050" t="19050" r="15240" b="26670"/>
             <wp:docPr id="1564029744" name="Imagen 8"/>
             <wp:cNvGraphicFramePr>
               <a:graphicFrameLocks xmlns:a="http://schemas.openxmlformats.org/drawingml/2006/main" noChangeAspect="1"/>
@@ -1358,7 +1713,9 @@
                     </a:prstGeom>
                     <a:noFill/>
                     <a:ln>
-                      <a:noFill/>
+                      <a:solidFill>
+                        <a:schemeClr val="accent1"/>
+                      </a:solidFill>
                     </a:ln>
                   </pic:spPr>
                 </pic:pic>
@@ -1371,6 +1728,7 @@
     <w:p>
       <w:pPr>
         <w:spacing w:after="120" w:line="360" w:lineRule="auto"/>
+        <w:jc w:val="both"/>
         <w:rPr>
           <w:rFonts w:ascii="Arial" w:hAnsi="Arial" w:cs="Arial"/>
           <w:sz w:val="24"/>
@@ -1406,7 +1764,7 @@
     </w:p>
     <w:p>
       <w:pPr>
-        <w:pStyle w:val="Ttulo2"/>
+        <w:pStyle w:val="Heading2"/>
         <w:rPr>
           <w:rFonts w:ascii="Arial" w:hAnsi="Arial" w:cs="Arial"/>
         </w:rPr>
@@ -1439,7 +1797,7 @@
     </w:p>
     <w:p>
       <w:pPr>
-        <w:pStyle w:val="Prrafodelista"/>
+        <w:pStyle w:val="ListParagraph"/>
         <w:numPr>
           <w:ilvl w:val="0"/>
           <w:numId w:val="1"/>
@@ -1472,7 +1830,7 @@
     </w:p>
     <w:p>
       <w:pPr>
-        <w:pStyle w:val="Prrafodelista"/>
+        <w:pStyle w:val="ListParagraph"/>
         <w:numPr>
           <w:ilvl w:val="0"/>
           <w:numId w:val="1"/>
@@ -1505,7 +1863,7 @@
     </w:p>
     <w:p>
       <w:pPr>
-        <w:pStyle w:val="Prrafodelista"/>
+        <w:pStyle w:val="ListParagraph"/>
         <w:numPr>
           <w:ilvl w:val="0"/>
           <w:numId w:val="1"/>
@@ -1615,9 +1973,9 @@
           <w:noProof/>
         </w:rPr>
         <w:drawing>
-          <wp:inline distT="0" distB="0" distL="0" distR="0" wp14:anchorId="3F956B6F" wp14:editId="05BFC539">
+          <wp:inline distT="0" distB="0" distL="0" distR="0" wp14:anchorId="3F956B6F" wp14:editId="3517A9C4">
             <wp:extent cx="5099483" cy="4371975"/>
-            <wp:effectExtent l="0" t="0" r="6350" b="0"/>
+            <wp:effectExtent l="19050" t="19050" r="25400" b="9525"/>
             <wp:docPr id="347472441" name="Imagen 2"/>
             <wp:cNvGraphicFramePr>
               <a:graphicFrameLocks xmlns:a="http://schemas.openxmlformats.org/drawingml/2006/main" noChangeAspect="1"/>
@@ -1654,7 +2012,9 @@
                     </a:prstGeom>
                     <a:noFill/>
                     <a:ln>
-                      <a:noFill/>
+                      <a:solidFill>
+                        <a:schemeClr val="accent1"/>
+                      </a:solidFill>
                     </a:ln>
                   </pic:spPr>
                 </pic:pic>
@@ -1674,12 +2034,13 @@
     </w:p>
     <w:p>
       <w:pPr>
-        <w:pStyle w:val="Prrafodelista"/>
+        <w:pStyle w:val="ListParagraph"/>
         <w:numPr>
           <w:ilvl w:val="0"/>
           <w:numId w:val="1"/>
         </w:numPr>
         <w:spacing w:after="120" w:line="360" w:lineRule="auto"/>
+        <w:jc w:val="both"/>
         <w:rPr>
           <w:rFonts w:ascii="Arial" w:hAnsi="Arial" w:cs="Arial"/>
           <w:sz w:val="24"/>
@@ -1720,7 +2081,7 @@
           <w:noProof/>
         </w:rPr>
         <w:drawing>
-          <wp:inline distT="0" distB="0" distL="0" distR="0" wp14:anchorId="7720DBBC" wp14:editId="2336A819">
+          <wp:inline distT="0" distB="0" distL="0" distR="0" wp14:anchorId="7720DBBC" wp14:editId="7A9515BE">
             <wp:extent cx="5394960" cy="3116580"/>
             <wp:effectExtent l="0" t="0" r="0" b="7620"/>
             <wp:docPr id="1518396533" name="Imagen 12"/>
@@ -1771,7 +2132,7 @@
     </w:p>
     <w:p>
       <w:pPr>
-        <w:pStyle w:val="Prrafodelista"/>
+        <w:pStyle w:val="ListParagraph"/>
         <w:numPr>
           <w:ilvl w:val="0"/>
           <w:numId w:val="1"/>
@@ -1798,7 +2159,7 @@
     </w:p>
     <w:p>
       <w:pPr>
-        <w:pStyle w:val="Prrafodelista"/>
+        <w:pStyle w:val="ListParagraph"/>
         <w:spacing w:after="120" w:line="360" w:lineRule="auto"/>
         <w:rPr>
           <w:rFonts w:ascii="Arial" w:hAnsi="Arial" w:cs="Arial"/>
@@ -1860,23 +2221,17 @@
     </w:p>
     <w:p>
       <w:pPr>
-        <w:pStyle w:val="Ttulo1"/>
-        <w:rPr>
-          <w:rFonts w:ascii="Arial" w:hAnsi="Arial" w:cs="Arial"/>
-        </w:rPr>
-      </w:pPr>
-    </w:p>
-    <w:p>
-      <w:pPr>
-        <w:pStyle w:val="Ttulo1"/>
-        <w:rPr>
-          <w:rFonts w:ascii="Arial" w:hAnsi="Arial" w:cs="Arial"/>
-        </w:rPr>
-      </w:pPr>
-      <w:r>
-        <w:rPr>
-          <w:rFonts w:ascii="Arial" w:hAnsi="Arial" w:cs="Arial"/>
-        </w:rPr>
+        <w:pStyle w:val="Heading1"/>
+        <w:jc w:val="center"/>
+        <w:rPr>
+          <w:rFonts w:ascii="Arial" w:hAnsi="Arial" w:cs="Arial"/>
+        </w:rPr>
+      </w:pPr>
+      <w:r>
+        <w:rPr>
+          <w:rFonts w:ascii="Arial" w:hAnsi="Arial" w:cs="Arial"/>
+        </w:rPr>
+        <w:lastRenderedPageBreak/>
         <w:t>Descripción del Requerimiento</w:t>
       </w:r>
     </w:p>
@@ -1902,9 +2257,9 @@
           <w:noProof/>
         </w:rPr>
         <w:drawing>
-          <wp:inline distT="0" distB="0" distL="0" distR="0" wp14:anchorId="5B3CE765" wp14:editId="7A09ED26">
+          <wp:inline distT="0" distB="0" distL="0" distR="0" wp14:anchorId="5B3CE765" wp14:editId="6A771267">
             <wp:extent cx="5400040" cy="2105025"/>
-            <wp:effectExtent l="0" t="0" r="0" b="9525"/>
+            <wp:effectExtent l="19050" t="19050" r="10160" b="28575"/>
             <wp:docPr id="1456734203" name="Imagen 24"/>
             <wp:cNvGraphicFramePr>
               <a:graphicFrameLocks xmlns:a="http://schemas.openxmlformats.org/drawingml/2006/main" noChangeAspect="1"/>
@@ -1941,7 +2296,9 @@
                     </a:prstGeom>
                     <a:noFill/>
                     <a:ln>
-                      <a:noFill/>
+                      <a:solidFill>
+                        <a:schemeClr val="accent1"/>
+                      </a:solidFill>
                     </a:ln>
                   </pic:spPr>
                 </pic:pic>
@@ -1954,6 +2311,7 @@
     <w:p>
       <w:pPr>
         <w:spacing w:line="360" w:lineRule="auto"/>
+        <w:jc w:val="both"/>
         <w:rPr>
           <w:rFonts w:ascii="Arial" w:hAnsi="Arial" w:cs="Arial"/>
           <w:sz w:val="24"/>
@@ -2073,48 +2431,24 @@
     </w:p>
     <w:p>
       <w:pPr>
-        <w:pStyle w:val="Ttulo1"/>
-        <w:rPr>
-          <w:rFonts w:ascii="Arial" w:hAnsi="Arial" w:cs="Arial"/>
-        </w:rPr>
-      </w:pPr>
-    </w:p>
-    <w:p>
-      <w:pPr>
-        <w:pStyle w:val="Ttulo1"/>
-        <w:rPr>
-          <w:rFonts w:ascii="Arial" w:hAnsi="Arial" w:cs="Arial"/>
-        </w:rPr>
-      </w:pPr>
-    </w:p>
-    <w:p>
-      <w:pPr>
-        <w:pStyle w:val="Ttulo1"/>
-        <w:rPr>
-          <w:rFonts w:ascii="Arial" w:hAnsi="Arial" w:cs="Arial"/>
-        </w:rPr>
-      </w:pPr>
-    </w:p>
-    <w:p>
-      <w:pPr>
-        <w:pStyle w:val="Ttulo1"/>
-        <w:rPr>
-          <w:rFonts w:ascii="Arial" w:hAnsi="Arial" w:cs="Arial"/>
-        </w:rPr>
-      </w:pPr>
-    </w:p>
-    <w:p>
-      <w:pPr>
-        <w:pStyle w:val="Ttulo1"/>
-        <w:rPr>
-          <w:rFonts w:ascii="Arial" w:hAnsi="Arial" w:cs="Arial"/>
-        </w:rPr>
-      </w:pPr>
-    </w:p>
-    <w:p/>
-    <w:p>
-      <w:pPr>
-        <w:pStyle w:val="Ttulo1"/>
+        <w:rPr>
+          <w:rFonts w:ascii="Arial" w:eastAsiaTheme="majorEastAsia" w:hAnsi="Arial" w:cs="Arial"/>
+          <w:color w:val="2F5496" w:themeColor="accent1" w:themeShade="BF"/>
+          <w:sz w:val="40"/>
+          <w:szCs w:val="40"/>
+        </w:rPr>
+      </w:pPr>
+      <w:r>
+        <w:rPr>
+          <w:rFonts w:ascii="Arial" w:hAnsi="Arial" w:cs="Arial"/>
+        </w:rPr>
+        <w:br w:type="page"/>
+      </w:r>
+    </w:p>
+    <w:p>
+      <w:pPr>
+        <w:pStyle w:val="Heading1"/>
+        <w:jc w:val="center"/>
         <w:rPr>
           <w:rFonts w:ascii="Arial" w:hAnsi="Arial" w:cs="Arial"/>
         </w:rPr>
@@ -2129,6 +2463,8 @@
     </w:p>
     <w:p>
       <w:pPr>
+        <w:spacing w:line="360" w:lineRule="auto"/>
+        <w:jc w:val="both"/>
         <w:rPr>
           <w:rFonts w:ascii="Arial" w:hAnsi="Arial" w:cs="Arial"/>
           <w:sz w:val="24"/>
@@ -2236,31 +2572,31 @@
     </w:p>
     <w:p>
       <w:pPr>
-        <w:pStyle w:val="Ttulo1"/>
-        <w:rPr>
-          <w:rFonts w:ascii="Arial" w:hAnsi="Arial" w:cs="Arial"/>
-        </w:rPr>
-      </w:pPr>
-    </w:p>
-    <w:p>
-      <w:pPr>
-        <w:pStyle w:val="Ttulo1"/>
-        <w:rPr>
-          <w:rFonts w:ascii="Arial" w:hAnsi="Arial" w:cs="Arial"/>
-        </w:rPr>
-      </w:pPr>
-    </w:p>
-    <w:p>
-      <w:pPr>
-        <w:pStyle w:val="Ttulo1"/>
-        <w:rPr>
-          <w:rFonts w:ascii="Arial" w:hAnsi="Arial" w:cs="Arial"/>
-        </w:rPr>
-      </w:pPr>
-    </w:p>
-    <w:p>
-      <w:pPr>
-        <w:pStyle w:val="Ttulo1"/>
+        <w:pStyle w:val="Heading1"/>
+        <w:rPr>
+          <w:rFonts w:ascii="Arial" w:hAnsi="Arial" w:cs="Arial"/>
+        </w:rPr>
+      </w:pPr>
+    </w:p>
+    <w:p>
+      <w:pPr>
+        <w:pStyle w:val="Heading1"/>
+        <w:rPr>
+          <w:rFonts w:ascii="Arial" w:hAnsi="Arial" w:cs="Arial"/>
+        </w:rPr>
+      </w:pPr>
+    </w:p>
+    <w:p>
+      <w:pPr>
+        <w:pStyle w:val="Heading1"/>
+        <w:rPr>
+          <w:rFonts w:ascii="Arial" w:hAnsi="Arial" w:cs="Arial"/>
+        </w:rPr>
+      </w:pPr>
+    </w:p>
+    <w:p>
+      <w:pPr>
+        <w:pStyle w:val="Heading1"/>
         <w:rPr>
           <w:rFonts w:ascii="Arial" w:hAnsi="Arial" w:cs="Arial"/>
         </w:rPr>
@@ -2270,39 +2606,15 @@
     <w:p/>
     <w:p>
       <w:pPr>
-        <w:pStyle w:val="Ttulo1"/>
-        <w:rPr>
-          <w:rFonts w:ascii="Arial" w:hAnsi="Arial" w:cs="Arial"/>
-        </w:rPr>
-      </w:pPr>
-    </w:p>
-    <w:p>
-      <w:pPr>
-        <w:pStyle w:val="Ttulo1"/>
-        <w:rPr>
-          <w:rFonts w:ascii="Arial" w:hAnsi="Arial" w:cs="Arial"/>
-        </w:rPr>
-      </w:pPr>
-    </w:p>
-    <w:p>
-      <w:pPr>
-        <w:pStyle w:val="Ttulo1"/>
-        <w:rPr>
-          <w:rFonts w:ascii="Arial" w:hAnsi="Arial" w:cs="Arial"/>
-        </w:rPr>
-      </w:pPr>
-    </w:p>
-    <w:p>
-      <w:pPr>
-        <w:pStyle w:val="Ttulo1"/>
-        <w:rPr>
-          <w:rFonts w:ascii="Arial" w:hAnsi="Arial" w:cs="Arial"/>
-        </w:rPr>
-      </w:pPr>
-    </w:p>
-    <w:p>
-      <w:pPr>
-        <w:pStyle w:val="Ttulo1"/>
+        <w:pStyle w:val="Heading1"/>
+        <w:rPr>
+          <w:rFonts w:ascii="Arial" w:hAnsi="Arial" w:cs="Arial"/>
+        </w:rPr>
+      </w:pPr>
+    </w:p>
+    <w:p>
+      <w:pPr>
+        <w:pStyle w:val="Heading1"/>
         <w:rPr>
           <w:rFonts w:ascii="Arial" w:hAnsi="Arial" w:cs="Arial"/>
         </w:rPr>
@@ -2310,9 +2622,11 @@
     </w:p>
     <w:p/>
     <w:p/>
-    <w:p>
-      <w:pPr>
-        <w:pStyle w:val="Ttulo1"/>
+    <w:p/>
+    <w:p>
+      <w:pPr>
+        <w:pStyle w:val="Heading1"/>
+        <w:jc w:val="center"/>
         <w:rPr>
           <w:rFonts w:ascii="Arial" w:hAnsi="Arial" w:cs="Arial"/>
         </w:rPr>
@@ -2343,17 +2657,21 @@
         <w:t>es</w:t>
       </w:r>
     </w:p>
-    <w:p/>
-    <w:p>
-      <w:pPr>
-        <w:pStyle w:val="Ttulo2"/>
-        <w:rPr>
-          <w:rFonts w:ascii="Arial" w:hAnsi="Arial" w:cs="Arial"/>
-        </w:rPr>
-      </w:pPr>
-      <w:r>
-        <w:rPr>
-          <w:rFonts w:ascii="Arial" w:hAnsi="Arial" w:cs="Arial"/>
+    <w:p>
+      <w:pPr>
+        <w:pStyle w:val="Heading2"/>
+        <w:jc w:val="both"/>
+        <w:rPr>
+          <w:rFonts w:ascii="Arial" w:hAnsi="Arial" w:cs="Arial"/>
+          <w:sz w:val="30"/>
+          <w:szCs w:val="30"/>
+        </w:rPr>
+      </w:pPr>
+      <w:r>
+        <w:rPr>
+          <w:rFonts w:ascii="Arial" w:hAnsi="Arial" w:cs="Arial"/>
+          <w:sz w:val="30"/>
+          <w:szCs w:val="30"/>
         </w:rPr>
         <w:t>Exequiel Gutiérrez</w:t>
       </w:r>
@@ -2361,6 +2679,7 @@
     <w:p>
       <w:pPr>
         <w:spacing w:line="360" w:lineRule="auto"/>
+        <w:jc w:val="both"/>
         <w:rPr>
           <w:rFonts w:ascii="Arial" w:hAnsi="Arial" w:cs="Arial"/>
           <w:sz w:val="24"/>
@@ -2414,8 +2733,9 @@
     </w:p>
     <w:p>
       <w:pPr>
-        <w:pStyle w:val="Ttulo2"/>
+        <w:pStyle w:val="Heading2"/>
         <w:spacing w:line="360" w:lineRule="auto"/>
+        <w:jc w:val="both"/>
         <w:rPr>
           <w:rFonts w:ascii="Arial" w:eastAsiaTheme="minorHAnsi" w:hAnsi="Arial" w:cs="Arial"/>
           <w:color w:val="auto"/>
@@ -2470,32 +2790,59 @@
           <w:sz w:val="24"/>
           <w:szCs w:val="24"/>
         </w:rPr>
-        <w:t>, y agregó sección de clientes con imágenes e hipervínculo enlazado a la sección.</w:t>
-      </w:r>
-    </w:p>
-    <w:p>
-      <w:pPr>
-        <w:pStyle w:val="Ttulo2"/>
+        <w:t>, y agregó sección de cli</w:t>
+      </w:r>
+      <w:r>
+        <w:rPr>
+          <w:rFonts w:ascii="Arial" w:eastAsiaTheme="minorHAnsi" w:hAnsi="Arial" w:cs="Arial"/>
+          <w:color w:val="auto"/>
+          <w:sz w:val="24"/>
+          <w:szCs w:val="24"/>
+        </w:rPr>
+        <w:t>entes</w:t>
+      </w:r>
+      <w:r>
+        <w:rPr>
+          <w:rFonts w:ascii="Arial" w:eastAsiaTheme="minorHAnsi" w:hAnsi="Arial" w:cs="Arial"/>
+          <w:color w:val="auto"/>
+          <w:sz w:val="24"/>
+          <w:szCs w:val="24"/>
+        </w:rPr>
+        <w:t xml:space="preserve"> con imágenes e hipervínculo enlazado a la sección.</w:t>
+      </w:r>
+    </w:p>
+    <w:p>
+      <w:pPr>
+        <w:pStyle w:val="Heading2"/>
         <w:spacing w:line="360" w:lineRule="auto"/>
-        <w:rPr>
-          <w:rFonts w:ascii="Arial" w:hAnsi="Arial" w:cs="Arial"/>
-        </w:rPr>
-      </w:pPr>
-      <w:r>
-        <w:rPr>
-          <w:rFonts w:ascii="Arial" w:hAnsi="Arial" w:cs="Arial"/>
+        <w:jc w:val="both"/>
+        <w:rPr>
+          <w:rFonts w:ascii="Arial" w:hAnsi="Arial" w:cs="Arial"/>
+          <w:sz w:val="30"/>
+          <w:szCs w:val="30"/>
+        </w:rPr>
+      </w:pPr>
+      <w:r>
+        <w:rPr>
+          <w:rFonts w:ascii="Arial" w:hAnsi="Arial" w:cs="Arial"/>
+          <w:sz w:val="30"/>
+          <w:szCs w:val="30"/>
         </w:rPr>
         <w:t>Cristop</w:t>
       </w:r>
       <w:r>
         <w:rPr>
           <w:rFonts w:ascii="Arial" w:hAnsi="Arial" w:cs="Arial"/>
+          <w:sz w:val="30"/>
+          <w:szCs w:val="30"/>
         </w:rPr>
         <w:t>h</w:t>
       </w:r>
       <w:r>
         <w:rPr>
           <w:rFonts w:ascii="Arial" w:hAnsi="Arial" w:cs="Arial"/>
+          <w:sz w:val="30"/>
+          <w:szCs w:val="30"/>
         </w:rPr>
         <w:t>er González</w:t>
       </w:r>
@@ -2503,6 +2850,7 @@
     <w:p>
       <w:pPr>
         <w:spacing w:line="360" w:lineRule="auto"/>
+        <w:jc w:val="both"/>
         <w:rPr>
           <w:rFonts w:ascii="Arial" w:hAnsi="Arial" w:cs="Arial"/>
           <w:sz w:val="24"/>
@@ -2593,6 +2941,7 @@
     <w:p>
       <w:pPr>
         <w:spacing w:line="360" w:lineRule="auto"/>
+        <w:jc w:val="both"/>
         <w:rPr>
           <w:rFonts w:ascii="Arial" w:hAnsi="Arial" w:cs="Arial"/>
           <w:sz w:val="24"/>
@@ -2610,15 +2959,20 @@
     </w:p>
     <w:p>
       <w:pPr>
-        <w:pStyle w:val="Ttulo2"/>
+        <w:pStyle w:val="Heading2"/>
         <w:spacing w:line="360" w:lineRule="auto"/>
-        <w:rPr>
-          <w:rFonts w:ascii="Arial" w:hAnsi="Arial" w:cs="Arial"/>
-        </w:rPr>
-      </w:pPr>
-      <w:r>
-        <w:rPr>
-          <w:rFonts w:ascii="Arial" w:hAnsi="Arial" w:cs="Arial"/>
+        <w:jc w:val="both"/>
+        <w:rPr>
+          <w:rFonts w:ascii="Arial" w:hAnsi="Arial" w:cs="Arial"/>
+          <w:sz w:val="30"/>
+          <w:szCs w:val="30"/>
+        </w:rPr>
+      </w:pPr>
+      <w:r>
+        <w:rPr>
+          <w:rFonts w:ascii="Arial" w:hAnsi="Arial" w:cs="Arial"/>
+          <w:sz w:val="30"/>
+          <w:szCs w:val="30"/>
         </w:rPr>
         <w:t>Camilo Hernández</w:t>
       </w:r>
@@ -2626,6 +2980,7 @@
     <w:p>
       <w:pPr>
         <w:spacing w:line="360" w:lineRule="auto"/>
+        <w:jc w:val="both"/>
         <w:rPr>
           <w:rFonts w:ascii="Arial" w:hAnsi="Arial" w:cs="Arial"/>
           <w:sz w:val="24"/>
@@ -2659,14 +3014,19 @@
     </w:p>
     <w:p>
       <w:pPr>
-        <w:pStyle w:val="Ttulo2"/>
-        <w:rPr>
-          <w:rFonts w:ascii="Arial" w:hAnsi="Arial" w:cs="Arial"/>
-        </w:rPr>
-      </w:pPr>
-      <w:r>
-        <w:rPr>
-          <w:rFonts w:ascii="Arial" w:hAnsi="Arial" w:cs="Arial"/>
+        <w:pStyle w:val="Heading2"/>
+        <w:jc w:val="both"/>
+        <w:rPr>
+          <w:rFonts w:ascii="Arial" w:hAnsi="Arial" w:cs="Arial"/>
+          <w:sz w:val="30"/>
+          <w:szCs w:val="30"/>
+        </w:rPr>
+      </w:pPr>
+      <w:r>
+        <w:rPr>
+          <w:rFonts w:ascii="Arial" w:hAnsi="Arial" w:cs="Arial"/>
+          <w:sz w:val="30"/>
+          <w:szCs w:val="30"/>
         </w:rPr>
         <w:t>Gabriel González</w:t>
       </w:r>
@@ -2674,6 +3034,7 @@
     <w:p>
       <w:pPr>
         <w:spacing w:line="360" w:lineRule="auto"/>
+        <w:jc w:val="both"/>
         <w:rPr>
           <w:rFonts w:ascii="Arial" w:hAnsi="Arial" w:cs="Arial"/>
           <w:sz w:val="24"/>
@@ -2691,23 +3052,64 @@
     </w:p>
     <w:p>
       <w:pPr>
-        <w:pStyle w:val="Ttulo1"/>
-      </w:pPr>
-      <w:r>
+        <w:pStyle w:val="Heading1"/>
+        <w:jc w:val="both"/>
+        <w:rPr>
+          <w:rFonts w:ascii="Arial" w:hAnsi="Arial" w:cs="Arial"/>
+          <w:sz w:val="30"/>
+          <w:szCs w:val="30"/>
+        </w:rPr>
+      </w:pPr>
+      <w:r>
+        <w:rPr>
+          <w:rFonts w:ascii="Arial" w:hAnsi="Arial" w:cs="Arial"/>
+          <w:sz w:val="30"/>
+          <w:szCs w:val="30"/>
+        </w:rPr>
         <w:t>Jordi González</w:t>
       </w:r>
     </w:p>
     <w:p>
       <w:pPr>
         <w:spacing w:line="360" w:lineRule="auto"/>
-      </w:pPr>
-      <w:r>
-        <w:rPr>
-          <w:rFonts w:ascii="Arial" w:hAnsi="Arial" w:cs="Arial"/>
-          <w:sz w:val="24"/>
-          <w:szCs w:val="24"/>
-        </w:rPr>
-        <w:t>Se encargó en mejorar la sección de redes sociales del Mockup y en definir los íconos de contacto (WhatsApp, Instagram, Facebook, correo y ubicación), estableciendo un tamaño adecuado.</w:t>
+        <w:jc w:val="both"/>
+        <w:rPr>
+          <w:rFonts w:ascii="Arial" w:hAnsi="Arial" w:cs="Arial"/>
+          <w:sz w:val="24"/>
+          <w:szCs w:val="24"/>
+        </w:rPr>
+      </w:pPr>
+      <w:r>
+        <w:rPr>
+          <w:rFonts w:ascii="Arial" w:hAnsi="Arial" w:cs="Arial"/>
+          <w:sz w:val="24"/>
+          <w:szCs w:val="24"/>
+        </w:rPr>
+        <w:t xml:space="preserve">Se encargó en mejorar la sección de redes sociales del Mockup y en definir los íconos de contacto (WhatsApp, Instagram, Facebook, correo y ubicación), estableciendo un </w:t>
+      </w:r>
+      <w:r>
+        <w:rPr>
+          <w:rFonts w:ascii="Arial" w:hAnsi="Arial" w:cs="Arial"/>
+          <w:sz w:val="24"/>
+          <w:szCs w:val="24"/>
+        </w:rPr>
+        <w:t xml:space="preserve">tamaño </w:t>
+      </w:r>
+      <w:r>
+        <w:rPr>
+          <w:rFonts w:ascii="Arial" w:hAnsi="Arial" w:cs="Arial"/>
+          <w:sz w:val="24"/>
+          <w:szCs w:val="24"/>
+        </w:rPr>
+        <w:t>adecuad</w:t>
+      </w:r>
+      <w:r>
+        <w:rPr>
+          <w:rFonts w:ascii="Arial" w:hAnsi="Arial" w:cs="Arial"/>
+          <w:sz w:val="24"/>
+          <w:szCs w:val="24"/>
+        </w:rPr>
+        <w:t>o.</w:t>
       </w:r>
     </w:p>
     <w:p>
@@ -2729,7 +3131,106 @@
     </w:p>
     <w:p>
       <w:pPr>
-        <w:pStyle w:val="Ttulo1"/>
+        <w:spacing w:line="360" w:lineRule="auto"/>
+        <w:jc w:val="both"/>
+        <w:rPr>
+          <w:rFonts w:ascii="Arial" w:hAnsi="Arial" w:cs="Arial"/>
+          <w:sz w:val="24"/>
+          <w:szCs w:val="24"/>
+          <w:u w:val="single"/>
+        </w:rPr>
+      </w:pPr>
+    </w:p>
+    <w:p>
+      <w:pPr>
+        <w:pStyle w:val="Heading1"/>
+        <w:rPr>
+          <w:rFonts w:ascii="Arial" w:hAnsi="Arial" w:cs="Arial"/>
+          <w:sz w:val="30"/>
+          <w:szCs w:val="30"/>
+        </w:rPr>
+      </w:pPr>
+      <w:r>
+        <w:rPr>
+          <w:rFonts w:ascii="Arial" w:hAnsi="Arial" w:cs="Arial"/>
+          <w:sz w:val="30"/>
+          <w:szCs w:val="30"/>
+        </w:rPr>
+        <w:t>Cristian Gajardo</w:t>
+      </w:r>
+    </w:p>
+    <w:p>
+      <w:pPr>
+        <w:spacing w:line="360" w:lineRule="auto"/>
+        <w:jc w:val="both"/>
+        <w:rPr>
+          <w:rFonts w:ascii="Arial" w:hAnsi="Arial" w:cs="Arial"/>
+          <w:sz w:val="24"/>
+          <w:szCs w:val="24"/>
+        </w:rPr>
+      </w:pPr>
+      <w:r>
+        <w:rPr>
+          <w:rFonts w:ascii="Arial" w:hAnsi="Arial" w:cs="Arial"/>
+          <w:sz w:val="24"/>
+          <w:szCs w:val="24"/>
+        </w:rPr>
+        <w:t>Testeo y revisión del proyecto, verificando que no quedaran fal</w:t>
+      </w:r>
+      <w:r>
+        <w:rPr>
+          <w:rFonts w:ascii="Arial" w:hAnsi="Arial" w:cs="Arial"/>
+          <w:sz w:val="24"/>
+          <w:szCs w:val="24"/>
+        </w:rPr>
+        <w:t>t</w:t>
+      </w:r>
+      <w:r>
+        <w:rPr>
+          <w:rFonts w:ascii="Arial" w:hAnsi="Arial" w:cs="Arial"/>
+          <w:sz w:val="24"/>
+          <w:szCs w:val="24"/>
+        </w:rPr>
+        <w:t>as en la ortografía.</w:t>
+      </w:r>
+      <w:r>
+        <w:rPr>
+          <w:rFonts w:ascii="Arial" w:hAnsi="Arial" w:cs="Arial"/>
+          <w:sz w:val="24"/>
+          <w:szCs w:val="24"/>
+        </w:rPr>
+        <w:br/>
+      </w:r>
+      <w:r>
+        <w:rPr>
+          <w:rFonts w:ascii="Arial" w:hAnsi="Arial" w:cs="Arial"/>
+          <w:sz w:val="24"/>
+          <w:szCs w:val="24"/>
+        </w:rPr>
+        <w:t>Identificó la falta de un logo y el uso de imágenes de stock no concordantes. En base a esto, se modificó el proyecto, ajustando el logo al encabezado de la página y actualizando la sección de stock con fotografías tomadas del inventario actual, según las redes sociales del emprendedor.</w:t>
+      </w:r>
+    </w:p>
+    <w:p>
+      <w:pPr>
+        <w:rPr>
+          <w:rFonts w:ascii="Arial" w:hAnsi="Arial" w:cs="Arial"/>
+          <w:sz w:val="24"/>
+          <w:szCs w:val="24"/>
+        </w:rPr>
+      </w:pPr>
+      <w:r>
+        <w:rPr>
+          <w:rFonts w:ascii="Arial" w:hAnsi="Arial" w:cs="Arial"/>
+          <w:sz w:val="24"/>
+          <w:szCs w:val="24"/>
+        </w:rPr>
+        <w:br w:type="page"/>
+      </w:r>
+    </w:p>
+    <w:p>
+      <w:pPr>
+        <w:pStyle w:val="Heading1"/>
+        <w:jc w:val="center"/>
         <w:rPr>
           <w:rFonts w:ascii="Arial" w:hAnsi="Arial" w:cs="Arial"/>
         </w:rPr>
@@ -2745,6 +3246,7 @@
     <w:p>
       <w:pPr>
         <w:spacing w:line="360" w:lineRule="auto"/>
+        <w:jc w:val="both"/>
         <w:rPr>
           <w:rFonts w:ascii="Arial" w:hAnsi="Arial" w:cs="Arial"/>
           <w:sz w:val="24"/>
@@ -2763,6 +3265,7 @@
     <w:p>
       <w:pPr>
         <w:spacing w:line="360" w:lineRule="auto"/>
+        <w:jc w:val="both"/>
         <w:rPr>
           <w:rFonts w:ascii="Arial" w:hAnsi="Arial" w:cs="Arial"/>
           <w:sz w:val="24"/>
@@ -2781,6 +3284,7 @@
     <w:p>
       <w:pPr>
         <w:spacing w:line="360" w:lineRule="auto"/>
+        <w:jc w:val="both"/>
         <w:rPr>
           <w:rFonts w:ascii="Arial" w:hAnsi="Arial" w:cs="Arial"/>
           <w:sz w:val="24"/>
@@ -2818,8 +3322,121 @@
 </file>
 
 <file path=word/numbering.xml><?xml version="1.0" encoding="utf-8"?>
-<w:numbering xmlns:wpc="http://schemas.microsoft.com/office/word/2010/wordprocessingCanvas" xmlns:cx="http://schemas.microsoft.com/office/drawing/2014/chartex" xmlns:cx1="http://schemas.microsoft.com/office/drawing/2015/9/8/chartex" xmlns:cx2="http://schemas.microsoft.com/office/drawing/2015/10/21/chartex" xmlns:cx3="http://schemas.microsoft.com/office/drawing/2016/5/9/chartex" xmlns:cx4="http://schemas.microsoft.com/office/drawing/2016/5/10/chartex" xmlns:cx5="http://schemas.microsoft.com/office/drawing/2016/5/11/chartex" xmlns:cx6="http://schemas.microsoft.com/office/drawing/2016/5/12/chartex" xmlns:cx7="http://schemas.microsoft.com/office/drawing/2016/5/13/chartex" xmlns:cx8="http://schemas.microsoft.com/office/drawing/2016/5/14/chartex" xmlns:mc="http://schemas.openxmlformats.org/markup-compatibility/2006" xmlns:aink="http://schemas.microsoft.com/office/drawing/2016/ink" xmlns:am3d="http://schemas.microsoft.com/office/drawing/2017/model3d" xmlns:o="urn:schemas-microsoft-com:office:office" xmlns:oel="http://schemas.microsoft.com/office/2019/extlst" xmlns:r="http://schemas.openxmlformats.org/officeDocument/2006/relationships" xmlns:m="http://schemas.openxmlformats.org/officeDocument/2006/math" xmlns:v="urn:schemas-microsoft-com:vml" xmlns:wp14="http://schemas.microsoft.com/office/word/2010/wordprocessingDrawing" xmlns:wp="http://schemas.openxmlformats.org/drawingml/2006/wordprocessingDrawing" xmlns:w10="urn:schemas-microsoft-com:office:word" xmlns:w="http://schemas.openxmlformats.org/wordprocessingml/2006/main" xmlns:w14="http://schemas.microsoft.com/office/word/2010/wordml" xmlns:w15="http://schemas.microsoft.com/office/word/2012/wordml" xmlns:w16cex="http://schemas.microsoft.com/office/word/2018/wordml/cex" xmlns:w16cid="http://schemas.microsoft.com/office/word/2016/wordml/cid" xmlns:w16="http://schemas.microsoft.com/office/word/2018/wordml" xmlns:w16du="http://schemas.microsoft.com/office/word/2023/wordml/word16du" xmlns:w16sdtdh="http://schemas.microsoft.com/office/word/2020/wordml/sdtdatahash" xmlns:w16sdtfl="http://schemas.microsoft.com/office/word/2024/wordml/sdtformatlock" xmlns:w16se="http://schemas.microsoft.com/office/word/2015/wordml/symex" xmlns:wpg="http://schemas.microsoft.com/office/word/2010/wordprocessingGroup" xmlns:wpi="http://schemas.microsoft.com/office/word/2010/wordprocessingInk" xmlns:wne="http://schemas.microsoft.com/office/word/2006/wordml" xmlns:wps="http://schemas.microsoft.com/office/word/2010/wordprocessingShape" mc:Ignorable="w14 w15 w16se w16cid w16 w16cex w16sdtdh w16sdtfl w16du wp14">
+<w:numbering xmlns:wpc="http://schemas.microsoft.com/office/word/2010/wordprocessingCanvas" xmlns:cx="http://schemas.microsoft.com/office/drawing/2014/chartex" xmlns:cx1="http://schemas.microsoft.com/office/drawing/2015/9/8/chartex" xmlns:cx2="http://schemas.microsoft.com/office/drawing/2015/10/21/chartex" xmlns:cx3="http://schemas.microsoft.com/office/drawing/2016/5/9/chartex" xmlns:cx4="http://schemas.microsoft.com/office/drawing/2016/5/10/chartex" xmlns:cx5="http://schemas.microsoft.com/office/drawing/2016/5/11/chartex" xmlns:cx6="http://schemas.microsoft.com/office/drawing/2016/5/12/chartex" xmlns:cx7="http://schemas.microsoft.com/office/drawing/2016/5/13/chartex" xmlns:cx8="http://schemas.microsoft.com/office/drawing/2016/5/14/chartex" xmlns:mc="http://schemas.openxmlformats.org/markup-compatibility/2006" xmlns:aink="http://schemas.microsoft.com/office/drawing/2016/ink" xmlns:am3d="http://schemas.microsoft.com/office/drawing/2017/model3d" xmlns:o="urn:schemas-microsoft-com:office:office" xmlns:oel="http://schemas.microsoft.com/office/2019/extlst" xmlns:r="http://schemas.openxmlformats.org/officeDocument/2006/relationships" xmlns:m="http://schemas.openxmlformats.org/officeDocument/2006/math" xmlns:v="urn:schemas-microsoft-com:vml" xmlns:wp14="http://schemas.microsoft.com/office/word/2010/wordprocessingDrawing" xmlns:wp="http://schemas.openxmlformats.org/drawingml/2006/wordprocessingDrawing" xmlns:w10="urn:schemas-microsoft-com:office:word" xmlns:w="http://schemas.openxmlformats.org/wordprocessingml/2006/main" xmlns:w14="http://schemas.microsoft.com/office/word/2010/wordml" xmlns:w15="http://schemas.microsoft.com/office/word/2012/wordml" xmlns:w16cex="http://schemas.microsoft.com/office/word/2018/wordml/cex" xmlns:w16cid="http://schemas.microsoft.com/office/word/2016/wordml/cid" xmlns:w16="http://schemas.microsoft.com/office/word/2018/wordml" xmlns:w16sdtdh="http://schemas.microsoft.com/office/word/2020/wordml/sdtdatahash" xmlns:w16se="http://schemas.microsoft.com/office/word/2015/wordml/symex" xmlns:wpg="http://schemas.microsoft.com/office/word/2010/wordprocessingGroup" xmlns:wpi="http://schemas.microsoft.com/office/word/2010/wordprocessingInk" xmlns:wne="http://schemas.microsoft.com/office/word/2006/wordml" xmlns:wps="http://schemas.microsoft.com/office/word/2010/wordprocessingShape" mc:Ignorable="w14 w15 w16se w16cid w16 w16cex w16sdtdh wp14">
   <w:abstractNum w:abstractNumId="0" w15:restartNumberingAfterBreak="0">
+    <w:nsid w:val="01705D2E"/>
+    <w:multiLevelType w:val="hybridMultilevel"/>
+    <w:tmpl w:val="D3C00E56"/>
+    <w:lvl w:ilvl="0" w:tplc="0C0A0001">
+      <w:start w:val="1"/>
+      <w:numFmt w:val="bullet"/>
+      <w:lvlText w:val=""/>
+      <w:lvlJc w:val="left"/>
+      <w:pPr>
+        <w:ind w:left="720" w:hanging="360"/>
+      </w:pPr>
+      <w:rPr>
+        <w:rFonts w:ascii="Symbol" w:hAnsi="Symbol" w:hint="default"/>
+      </w:rPr>
+    </w:lvl>
+    <w:lvl w:ilvl="1" w:tplc="0C0A0003" w:tentative="1">
+      <w:start w:val="1"/>
+      <w:numFmt w:val="bullet"/>
+      <w:lvlText w:val="o"/>
+      <w:lvlJc w:val="left"/>
+      <w:pPr>
+        <w:ind w:left="1440" w:hanging="360"/>
+      </w:pPr>
+      <w:rPr>
+        <w:rFonts w:ascii="Courier New" w:hAnsi="Courier New" w:cs="Courier New" w:hint="default"/>
+      </w:rPr>
+    </w:lvl>
+    <w:lvl w:ilvl="2" w:tplc="0C0A0005" w:tentative="1">
+      <w:start w:val="1"/>
+      <w:numFmt w:val="bullet"/>
+      <w:lvlText w:val=""/>
+      <w:lvlJc w:val="left"/>
+      <w:pPr>
+        <w:ind w:left="2160" w:hanging="360"/>
+      </w:pPr>
+      <w:rPr>
+        <w:rFonts w:ascii="Wingdings" w:hAnsi="Wingdings" w:hint="default"/>
+      </w:rPr>
+    </w:lvl>
+    <w:lvl w:ilvl="3" w:tplc="0C0A0001" w:tentative="1">
+      <w:start w:val="1"/>
+      <w:numFmt w:val="bullet"/>
+      <w:lvlText w:val=""/>
+      <w:lvlJc w:val="left"/>
+      <w:pPr>
+        <w:ind w:left="2880" w:hanging="360"/>
+      </w:pPr>
+      <w:rPr>
+        <w:rFonts w:ascii="Symbol" w:hAnsi="Symbol" w:hint="default"/>
+      </w:rPr>
+    </w:lvl>
+    <w:lvl w:ilvl="4" w:tplc="0C0A0003" w:tentative="1">
+      <w:start w:val="1"/>
+      <w:numFmt w:val="bullet"/>
+      <w:lvlText w:val="o"/>
+      <w:lvlJc w:val="left"/>
+      <w:pPr>
+        <w:ind w:left="3600" w:hanging="360"/>
+      </w:pPr>
+      <w:rPr>
+        <w:rFonts w:ascii="Courier New" w:hAnsi="Courier New" w:cs="Courier New" w:hint="default"/>
+      </w:rPr>
+    </w:lvl>
+    <w:lvl w:ilvl="5" w:tplc="0C0A0005" w:tentative="1">
+      <w:start w:val="1"/>
+      <w:numFmt w:val="bullet"/>
+      <w:lvlText w:val=""/>
+      <w:lvlJc w:val="left"/>
+      <w:pPr>
+        <w:ind w:left="4320" w:hanging="360"/>
+      </w:pPr>
+      <w:rPr>
+        <w:rFonts w:ascii="Wingdings" w:hAnsi="Wingdings" w:hint="default"/>
+      </w:rPr>
+    </w:lvl>
+    <w:lvl w:ilvl="6" w:tplc="0C0A0001" w:tentative="1">
+      <w:start w:val="1"/>
+      <w:numFmt w:val="bullet"/>
+      <w:lvlText w:val=""/>
+      <w:lvlJc w:val="left"/>
+      <w:pPr>
+        <w:ind w:left="5040" w:hanging="360"/>
+      </w:pPr>
+      <w:rPr>
+        <w:rFonts w:ascii="Symbol" w:hAnsi="Symbol" w:hint="default"/>
+      </w:rPr>
+    </w:lvl>
+    <w:lvl w:ilvl="7" w:tplc="0C0A0003" w:tentative="1">
+      <w:start w:val="1"/>
+      <w:numFmt w:val="bullet"/>
+      <w:lvlText w:val="o"/>
+      <w:lvlJc w:val="left"/>
+      <w:pPr>
+        <w:ind w:left="5760" w:hanging="360"/>
+      </w:pPr>
+      <w:rPr>
+        <w:rFonts w:ascii="Courier New" w:hAnsi="Courier New" w:cs="Courier New" w:hint="default"/>
+      </w:rPr>
+    </w:lvl>
+    <w:lvl w:ilvl="8" w:tplc="0C0A0005" w:tentative="1">
+      <w:start w:val="1"/>
+      <w:numFmt w:val="bullet"/>
+      <w:lvlText w:val=""/>
+      <w:lvlJc w:val="left"/>
+      <w:pPr>
+        <w:ind w:left="6480" w:hanging="360"/>
+      </w:pPr>
+      <w:rPr>
+        <w:rFonts w:ascii="Wingdings" w:hAnsi="Wingdings" w:hint="default"/>
+      </w:rPr>
+    </w:lvl>
+  </w:abstractNum>
+  <w:abstractNum w:abstractNumId="1" w15:restartNumberingAfterBreak="0">
     <w:nsid w:val="13E32E09"/>
     <w:multiLevelType w:val="hybridMultilevel"/>
     <w:tmpl w:val="A6FA4530"/>
@@ -2932,13 +3549,16 @@
     </w:lvl>
   </w:abstractNum>
   <w:num w:numId="1" w16cid:durableId="2438327">
+    <w:abstractNumId w:val="1"/>
+  </w:num>
+  <w:num w:numId="2" w16cid:durableId="678968066">
     <w:abstractNumId w:val="0"/>
   </w:num>
 </w:numbering>
 </file>
 
 <file path=word/styles.xml><?xml version="1.0" encoding="utf-8"?>
-<w:styles xmlns:mc="http://schemas.openxmlformats.org/markup-compatibility/2006" xmlns:r="http://schemas.openxmlformats.org/officeDocument/2006/relationships" xmlns:w="http://schemas.openxmlformats.org/wordprocessingml/2006/main" xmlns:w14="http://schemas.microsoft.com/office/word/2010/wordml" xmlns:w15="http://schemas.microsoft.com/office/word/2012/wordml" xmlns:w16cex="http://schemas.microsoft.com/office/word/2018/wordml/cex" xmlns:w16cid="http://schemas.microsoft.com/office/word/2016/wordml/cid" xmlns:w16="http://schemas.microsoft.com/office/word/2018/wordml" xmlns:w16du="http://schemas.microsoft.com/office/word/2023/wordml/word16du" xmlns:w16sdtdh="http://schemas.microsoft.com/office/word/2020/wordml/sdtdatahash" xmlns:w16sdtfl="http://schemas.microsoft.com/office/word/2024/wordml/sdtformatlock" xmlns:w16se="http://schemas.microsoft.com/office/word/2015/wordml/symex" mc:Ignorable="w14 w15 w16se w16cid w16 w16cex w16sdtdh w16sdtfl w16du">
+<w:styles xmlns:mc="http://schemas.openxmlformats.org/markup-compatibility/2006" xmlns:r="http://schemas.openxmlformats.org/officeDocument/2006/relationships" xmlns:w="http://schemas.openxmlformats.org/wordprocessingml/2006/main" xmlns:w14="http://schemas.microsoft.com/office/word/2010/wordml" xmlns:w15="http://schemas.microsoft.com/office/word/2012/wordml" xmlns:w16cex="http://schemas.microsoft.com/office/word/2018/wordml/cex" xmlns:w16cid="http://schemas.microsoft.com/office/word/2016/wordml/cid" xmlns:w16="http://schemas.microsoft.com/office/word/2018/wordml" xmlns:w16sdtdh="http://schemas.microsoft.com/office/word/2020/wordml/sdtdatahash" xmlns:w16se="http://schemas.microsoft.com/office/word/2015/wordml/symex" mc:Ignorable="w14 w15 w16se w16cid w16 w16cex w16sdtdh">
   <w:docDefaults>
     <w:rPrDefault>
       <w:rPr>
@@ -3341,11 +3961,11 @@
       <w:lang w:val="es-CL"/>
     </w:rPr>
   </w:style>
-  <w:style w:type="paragraph" w:styleId="Ttulo1">
+  <w:style w:type="paragraph" w:styleId="Heading1">
     <w:name w:val="heading 1"/>
     <w:basedOn w:val="Normal"/>
     <w:next w:val="Normal"/>
-    <w:link w:val="Ttulo1Car"/>
+    <w:link w:val="Heading1Char"/>
     <w:uiPriority w:val="9"/>
     <w:qFormat/>
     <w:rsid w:val="00086120"/>
@@ -3362,11 +3982,11 @@
       <w:szCs w:val="40"/>
     </w:rPr>
   </w:style>
-  <w:style w:type="paragraph" w:styleId="Ttulo2">
+  <w:style w:type="paragraph" w:styleId="Heading2">
     <w:name w:val="heading 2"/>
     <w:basedOn w:val="Normal"/>
     <w:next w:val="Normal"/>
-    <w:link w:val="Ttulo2Car"/>
+    <w:link w:val="Heading2Char"/>
     <w:uiPriority w:val="9"/>
     <w:unhideWhenUsed/>
     <w:qFormat/>
@@ -3384,11 +4004,11 @@
       <w:szCs w:val="32"/>
     </w:rPr>
   </w:style>
-  <w:style w:type="paragraph" w:styleId="Ttulo3">
+  <w:style w:type="paragraph" w:styleId="Heading3">
     <w:name w:val="heading 3"/>
     <w:basedOn w:val="Normal"/>
     <w:next w:val="Normal"/>
-    <w:link w:val="Ttulo3Car"/>
+    <w:link w:val="Heading3Char"/>
     <w:uiPriority w:val="9"/>
     <w:unhideWhenUsed/>
     <w:qFormat/>
@@ -3406,11 +4026,11 @@
       <w:szCs w:val="28"/>
     </w:rPr>
   </w:style>
-  <w:style w:type="paragraph" w:styleId="Ttulo4">
+  <w:style w:type="paragraph" w:styleId="Heading4">
     <w:name w:val="heading 4"/>
     <w:basedOn w:val="Normal"/>
     <w:next w:val="Normal"/>
-    <w:link w:val="Ttulo4Car"/>
+    <w:link w:val="Heading4Char"/>
     <w:uiPriority w:val="9"/>
     <w:semiHidden/>
     <w:unhideWhenUsed/>
@@ -3429,11 +4049,11 @@
       <w:color w:val="2F5496" w:themeColor="accent1" w:themeShade="BF"/>
     </w:rPr>
   </w:style>
-  <w:style w:type="paragraph" w:styleId="Ttulo5">
+  <w:style w:type="paragraph" w:styleId="Heading5">
     <w:name w:val="heading 5"/>
     <w:basedOn w:val="Normal"/>
     <w:next w:val="Normal"/>
-    <w:link w:val="Ttulo5Car"/>
+    <w:link w:val="Heading5Char"/>
     <w:uiPriority w:val="9"/>
     <w:semiHidden/>
     <w:unhideWhenUsed/>
@@ -3450,11 +4070,11 @@
       <w:color w:val="2F5496" w:themeColor="accent1" w:themeShade="BF"/>
     </w:rPr>
   </w:style>
-  <w:style w:type="paragraph" w:styleId="Ttulo6">
+  <w:style w:type="paragraph" w:styleId="Heading6">
     <w:name w:val="heading 6"/>
     <w:basedOn w:val="Normal"/>
     <w:next w:val="Normal"/>
-    <w:link w:val="Ttulo6Car"/>
+    <w:link w:val="Heading6Char"/>
     <w:uiPriority w:val="9"/>
     <w:semiHidden/>
     <w:unhideWhenUsed/>
@@ -3473,11 +4093,11 @@
       <w:color w:val="595959" w:themeColor="text1" w:themeTint="A6"/>
     </w:rPr>
   </w:style>
-  <w:style w:type="paragraph" w:styleId="Ttulo7">
+  <w:style w:type="paragraph" w:styleId="Heading7">
     <w:name w:val="heading 7"/>
     <w:basedOn w:val="Normal"/>
     <w:next w:val="Normal"/>
-    <w:link w:val="Ttulo7Car"/>
+    <w:link w:val="Heading7Char"/>
     <w:uiPriority w:val="9"/>
     <w:semiHidden/>
     <w:unhideWhenUsed/>
@@ -3494,11 +4114,11 @@
       <w:color w:val="595959" w:themeColor="text1" w:themeTint="A6"/>
     </w:rPr>
   </w:style>
-  <w:style w:type="paragraph" w:styleId="Ttulo8">
+  <w:style w:type="paragraph" w:styleId="Heading8">
     <w:name w:val="heading 8"/>
     <w:basedOn w:val="Normal"/>
     <w:next w:val="Normal"/>
-    <w:link w:val="Ttulo8Car"/>
+    <w:link w:val="Heading8Char"/>
     <w:uiPriority w:val="9"/>
     <w:semiHidden/>
     <w:unhideWhenUsed/>
@@ -3517,11 +4137,11 @@
       <w:color w:val="272727" w:themeColor="text1" w:themeTint="D8"/>
     </w:rPr>
   </w:style>
-  <w:style w:type="paragraph" w:styleId="Ttulo9">
+  <w:style w:type="paragraph" w:styleId="Heading9">
     <w:name w:val="heading 9"/>
     <w:basedOn w:val="Normal"/>
     <w:next w:val="Normal"/>
-    <w:link w:val="Ttulo9Car"/>
+    <w:link w:val="Heading9Char"/>
     <w:uiPriority w:val="9"/>
     <w:semiHidden/>
     <w:unhideWhenUsed/>
@@ -3538,13 +4158,12 @@
       <w:color w:val="272727" w:themeColor="text1" w:themeTint="D8"/>
     </w:rPr>
   </w:style>
-  <w:style w:type="character" w:default="1" w:styleId="Fuentedeprrafopredeter">
+  <w:style w:type="character" w:default="1" w:styleId="DefaultParagraphFont">
     <w:name w:val="Default Paragraph Font"/>
     <w:uiPriority w:val="1"/>
-    <w:semiHidden/>
     <w:unhideWhenUsed/>
   </w:style>
-  <w:style w:type="table" w:default="1" w:styleId="Tablanormal">
+  <w:style w:type="table" w:default="1" w:styleId="TableNormal">
     <w:name w:val="Normal Table"/>
     <w:uiPriority w:val="99"/>
     <w:semiHidden/>
@@ -3559,16 +4178,16 @@
       </w:tblCellMar>
     </w:tblPr>
   </w:style>
-  <w:style w:type="numbering" w:default="1" w:styleId="Sinlista">
+  <w:style w:type="numbering" w:default="1" w:styleId="NoList">
     <w:name w:val="No List"/>
     <w:uiPriority w:val="99"/>
     <w:semiHidden/>
     <w:unhideWhenUsed/>
   </w:style>
-  <w:style w:type="character" w:customStyle="1" w:styleId="Ttulo1Car">
-    <w:name w:val="Título 1 Car"/>
-    <w:basedOn w:val="Fuentedeprrafopredeter"/>
-    <w:link w:val="Ttulo1"/>
+  <w:style w:type="character" w:customStyle="1" w:styleId="Heading1Char">
+    <w:name w:val="Heading 1 Char"/>
+    <w:basedOn w:val="DefaultParagraphFont"/>
+    <w:link w:val="Heading1"/>
     <w:uiPriority w:val="9"/>
     <w:rsid w:val="00086120"/>
     <w:rPr>
@@ -3578,10 +4197,10 @@
       <w:szCs w:val="40"/>
     </w:rPr>
   </w:style>
-  <w:style w:type="character" w:customStyle="1" w:styleId="Ttulo2Car">
-    <w:name w:val="Título 2 Car"/>
-    <w:basedOn w:val="Fuentedeprrafopredeter"/>
-    <w:link w:val="Ttulo2"/>
+  <w:style w:type="character" w:customStyle="1" w:styleId="Heading2Char">
+    <w:name w:val="Heading 2 Char"/>
+    <w:basedOn w:val="DefaultParagraphFont"/>
+    <w:link w:val="Heading2"/>
     <w:uiPriority w:val="9"/>
     <w:rsid w:val="00086120"/>
     <w:rPr>
@@ -3591,10 +4210,10 @@
       <w:szCs w:val="32"/>
     </w:rPr>
   </w:style>
-  <w:style w:type="character" w:customStyle="1" w:styleId="Ttulo3Car">
-    <w:name w:val="Título 3 Car"/>
-    <w:basedOn w:val="Fuentedeprrafopredeter"/>
-    <w:link w:val="Ttulo3"/>
+  <w:style w:type="character" w:customStyle="1" w:styleId="Heading3Char">
+    <w:name w:val="Heading 3 Char"/>
+    <w:basedOn w:val="DefaultParagraphFont"/>
+    <w:link w:val="Heading3"/>
     <w:uiPriority w:val="9"/>
     <w:rsid w:val="00086120"/>
     <w:rPr>
@@ -3604,10 +4223,10 @@
       <w:szCs w:val="28"/>
     </w:rPr>
   </w:style>
-  <w:style w:type="character" w:customStyle="1" w:styleId="Ttulo4Car">
-    <w:name w:val="Título 4 Car"/>
-    <w:basedOn w:val="Fuentedeprrafopredeter"/>
-    <w:link w:val="Ttulo4"/>
+  <w:style w:type="character" w:customStyle="1" w:styleId="Heading4Char">
+    <w:name w:val="Heading 4 Char"/>
+    <w:basedOn w:val="DefaultParagraphFont"/>
+    <w:link w:val="Heading4"/>
     <w:uiPriority w:val="9"/>
     <w:semiHidden/>
     <w:rsid w:val="00086120"/>
@@ -3618,10 +4237,10 @@
       <w:color w:val="2F5496" w:themeColor="accent1" w:themeShade="BF"/>
     </w:rPr>
   </w:style>
-  <w:style w:type="character" w:customStyle="1" w:styleId="Ttulo5Car">
-    <w:name w:val="Título 5 Car"/>
-    <w:basedOn w:val="Fuentedeprrafopredeter"/>
-    <w:link w:val="Ttulo5"/>
+  <w:style w:type="character" w:customStyle="1" w:styleId="Heading5Char">
+    <w:name w:val="Heading 5 Char"/>
+    <w:basedOn w:val="DefaultParagraphFont"/>
+    <w:link w:val="Heading5"/>
     <w:uiPriority w:val="9"/>
     <w:semiHidden/>
     <w:rsid w:val="00086120"/>
@@ -3630,10 +4249,10 @@
       <w:color w:val="2F5496" w:themeColor="accent1" w:themeShade="BF"/>
     </w:rPr>
   </w:style>
-  <w:style w:type="character" w:customStyle="1" w:styleId="Ttulo6Car">
-    <w:name w:val="Título 6 Car"/>
-    <w:basedOn w:val="Fuentedeprrafopredeter"/>
-    <w:link w:val="Ttulo6"/>
+  <w:style w:type="character" w:customStyle="1" w:styleId="Heading6Char">
+    <w:name w:val="Heading 6 Char"/>
+    <w:basedOn w:val="DefaultParagraphFont"/>
+    <w:link w:val="Heading6"/>
     <w:uiPriority w:val="9"/>
     <w:semiHidden/>
     <w:rsid w:val="00086120"/>
@@ -3644,10 +4263,10 @@
       <w:color w:val="595959" w:themeColor="text1" w:themeTint="A6"/>
     </w:rPr>
   </w:style>
-  <w:style w:type="character" w:customStyle="1" w:styleId="Ttulo7Car">
-    <w:name w:val="Título 7 Car"/>
-    <w:basedOn w:val="Fuentedeprrafopredeter"/>
-    <w:link w:val="Ttulo7"/>
+  <w:style w:type="character" w:customStyle="1" w:styleId="Heading7Char">
+    <w:name w:val="Heading 7 Char"/>
+    <w:basedOn w:val="DefaultParagraphFont"/>
+    <w:link w:val="Heading7"/>
     <w:uiPriority w:val="9"/>
     <w:semiHidden/>
     <w:rsid w:val="00086120"/>
@@ -3656,10 +4275,10 @@
       <w:color w:val="595959" w:themeColor="text1" w:themeTint="A6"/>
     </w:rPr>
   </w:style>
-  <w:style w:type="character" w:customStyle="1" w:styleId="Ttulo8Car">
-    <w:name w:val="Título 8 Car"/>
-    <w:basedOn w:val="Fuentedeprrafopredeter"/>
-    <w:link w:val="Ttulo8"/>
+  <w:style w:type="character" w:customStyle="1" w:styleId="Heading8Char">
+    <w:name w:val="Heading 8 Char"/>
+    <w:basedOn w:val="DefaultParagraphFont"/>
+    <w:link w:val="Heading8"/>
     <w:uiPriority w:val="9"/>
     <w:semiHidden/>
     <w:rsid w:val="00086120"/>
@@ -3670,10 +4289,10 @@
       <w:color w:val="272727" w:themeColor="text1" w:themeTint="D8"/>
     </w:rPr>
   </w:style>
-  <w:style w:type="character" w:customStyle="1" w:styleId="Ttulo9Car">
-    <w:name w:val="Título 9 Car"/>
-    <w:basedOn w:val="Fuentedeprrafopredeter"/>
-    <w:link w:val="Ttulo9"/>
+  <w:style w:type="character" w:customStyle="1" w:styleId="Heading9Char">
+    <w:name w:val="Heading 9 Char"/>
+    <w:basedOn w:val="DefaultParagraphFont"/>
+    <w:link w:val="Heading9"/>
     <w:uiPriority w:val="9"/>
     <w:semiHidden/>
     <w:rsid w:val="00086120"/>
@@ -3682,11 +4301,11 @@
       <w:color w:val="272727" w:themeColor="text1" w:themeTint="D8"/>
     </w:rPr>
   </w:style>
-  <w:style w:type="paragraph" w:styleId="Ttulo">
+  <w:style w:type="paragraph" w:styleId="Title">
     <w:name w:val="Title"/>
     <w:basedOn w:val="Normal"/>
     <w:next w:val="Normal"/>
-    <w:link w:val="TtuloCar"/>
+    <w:link w:val="TitleChar"/>
     <w:uiPriority w:val="10"/>
     <w:qFormat/>
     <w:rsid w:val="00086120"/>
@@ -3702,10 +4321,10 @@
       <w:szCs w:val="56"/>
     </w:rPr>
   </w:style>
-  <w:style w:type="character" w:customStyle="1" w:styleId="TtuloCar">
-    <w:name w:val="Título Car"/>
-    <w:basedOn w:val="Fuentedeprrafopredeter"/>
-    <w:link w:val="Ttulo"/>
+  <w:style w:type="character" w:customStyle="1" w:styleId="TitleChar">
+    <w:name w:val="Title Char"/>
+    <w:basedOn w:val="DefaultParagraphFont"/>
+    <w:link w:val="Title"/>
     <w:uiPriority w:val="10"/>
     <w:rsid w:val="00086120"/>
     <w:rPr>
@@ -3716,11 +4335,11 @@
       <w:szCs w:val="56"/>
     </w:rPr>
   </w:style>
-  <w:style w:type="paragraph" w:styleId="Subttulo">
+  <w:style w:type="paragraph" w:styleId="Subtitle">
     <w:name w:val="Subtitle"/>
     <w:basedOn w:val="Normal"/>
     <w:next w:val="Normal"/>
-    <w:link w:val="SubttuloCar"/>
+    <w:link w:val="SubtitleChar"/>
     <w:uiPriority w:val="11"/>
     <w:qFormat/>
     <w:rsid w:val="00086120"/>
@@ -3737,10 +4356,10 @@
       <w:szCs w:val="28"/>
     </w:rPr>
   </w:style>
-  <w:style w:type="character" w:customStyle="1" w:styleId="SubttuloCar">
-    <w:name w:val="Subtítulo Car"/>
-    <w:basedOn w:val="Fuentedeprrafopredeter"/>
-    <w:link w:val="Subttulo"/>
+  <w:style w:type="character" w:customStyle="1" w:styleId="SubtitleChar">
+    <w:name w:val="Subtitle Char"/>
+    <w:basedOn w:val="DefaultParagraphFont"/>
+    <w:link w:val="Subtitle"/>
     <w:uiPriority w:val="11"/>
     <w:rsid w:val="00086120"/>
     <w:rPr>
@@ -3751,11 +4370,11 @@
       <w:szCs w:val="28"/>
     </w:rPr>
   </w:style>
-  <w:style w:type="paragraph" w:styleId="Cita">
+  <w:style w:type="paragraph" w:styleId="Quote">
     <w:name w:val="Quote"/>
     <w:basedOn w:val="Normal"/>
     <w:next w:val="Normal"/>
-    <w:link w:val="CitaCar"/>
+    <w:link w:val="QuoteChar"/>
     <w:uiPriority w:val="29"/>
     <w:qFormat/>
     <w:rsid w:val="00086120"/>
@@ -3769,10 +4388,10 @@
       <w:color w:val="404040" w:themeColor="text1" w:themeTint="BF"/>
     </w:rPr>
   </w:style>
-  <w:style w:type="character" w:customStyle="1" w:styleId="CitaCar">
-    <w:name w:val="Cita Car"/>
-    <w:basedOn w:val="Fuentedeprrafopredeter"/>
-    <w:link w:val="Cita"/>
+  <w:style w:type="character" w:customStyle="1" w:styleId="QuoteChar">
+    <w:name w:val="Quote Char"/>
+    <w:basedOn w:val="DefaultParagraphFont"/>
+    <w:link w:val="Quote"/>
     <w:uiPriority w:val="29"/>
     <w:rsid w:val="00086120"/>
     <w:rPr>
@@ -3781,7 +4400,7 @@
       <w:color w:val="404040" w:themeColor="text1" w:themeTint="BF"/>
     </w:rPr>
   </w:style>
-  <w:style w:type="paragraph" w:styleId="Prrafodelista">
+  <w:style w:type="paragraph" w:styleId="ListParagraph">
     <w:name w:val="List Paragraph"/>
     <w:basedOn w:val="Normal"/>
     <w:uiPriority w:val="34"/>
@@ -3792,9 +4411,9 @@
       <w:contextualSpacing/>
     </w:pPr>
   </w:style>
-  <w:style w:type="character" w:styleId="nfasisintenso">
+  <w:style w:type="character" w:styleId="IntenseEmphasis">
     <w:name w:val="Intense Emphasis"/>
-    <w:basedOn w:val="Fuentedeprrafopredeter"/>
+    <w:basedOn w:val="DefaultParagraphFont"/>
     <w:uiPriority w:val="21"/>
     <w:qFormat/>
     <w:rsid w:val="00086120"/>
@@ -3804,11 +4423,11 @@
       <w:color w:val="2F5496" w:themeColor="accent1" w:themeShade="BF"/>
     </w:rPr>
   </w:style>
-  <w:style w:type="paragraph" w:styleId="Citadestacada">
+  <w:style w:type="paragraph" w:styleId="IntenseQuote">
     <w:name w:val="Intense Quote"/>
     <w:basedOn w:val="Normal"/>
     <w:next w:val="Normal"/>
-    <w:link w:val="CitadestacadaCar"/>
+    <w:link w:val="IntenseQuoteChar"/>
     <w:uiPriority w:val="30"/>
     <w:qFormat/>
     <w:rsid w:val="00086120"/>
@@ -3827,10 +4446,10 @@
       <w:color w:val="2F5496" w:themeColor="accent1" w:themeShade="BF"/>
     </w:rPr>
   </w:style>
-  <w:style w:type="character" w:customStyle="1" w:styleId="CitadestacadaCar">
-    <w:name w:val="Cita destacada Car"/>
-    <w:basedOn w:val="Fuentedeprrafopredeter"/>
-    <w:link w:val="Citadestacada"/>
+  <w:style w:type="character" w:customStyle="1" w:styleId="IntenseQuoteChar">
+    <w:name w:val="Intense Quote Char"/>
+    <w:basedOn w:val="DefaultParagraphFont"/>
+    <w:link w:val="IntenseQuote"/>
     <w:uiPriority w:val="30"/>
     <w:rsid w:val="00086120"/>
     <w:rPr>
@@ -3839,9 +4458,9 @@
       <w:color w:val="2F5496" w:themeColor="accent1" w:themeShade="BF"/>
     </w:rPr>
   </w:style>
-  <w:style w:type="character" w:styleId="Referenciaintensa">
+  <w:style w:type="character" w:styleId="IntenseReference">
     <w:name w:val="Intense Reference"/>
-    <w:basedOn w:val="Fuentedeprrafopredeter"/>
+    <w:basedOn w:val="DefaultParagraphFont"/>
     <w:uiPriority w:val="32"/>
     <w:qFormat/>
     <w:rsid w:val="00086120"/>
@@ -3853,9 +4472,9 @@
       <w:spacing w:val="5"/>
     </w:rPr>
   </w:style>
-  <w:style w:type="paragraph" w:styleId="Sinespaciado">
+  <w:style w:type="paragraph" w:styleId="NoSpacing">
     <w:name w:val="No Spacing"/>
-    <w:link w:val="SinespaciadoCar"/>
+    <w:link w:val="NoSpacingChar"/>
     <w:uiPriority w:val="1"/>
     <w:qFormat/>
     <w:rsid w:val="00552900"/>
@@ -3869,10 +4488,10 @@
       <w14:ligatures w14:val="none"/>
     </w:rPr>
   </w:style>
-  <w:style w:type="character" w:customStyle="1" w:styleId="SinespaciadoCar">
-    <w:name w:val="Sin espaciado Car"/>
-    <w:basedOn w:val="Fuentedeprrafopredeter"/>
-    <w:link w:val="Sinespaciado"/>
+  <w:style w:type="character" w:customStyle="1" w:styleId="NoSpacingChar">
+    <w:name w:val="No Spacing Char"/>
+    <w:basedOn w:val="DefaultParagraphFont"/>
+    <w:link w:val="NoSpacing"/>
     <w:uiPriority w:val="1"/>
     <w:rsid w:val="00552900"/>
     <w:rPr>
@@ -3882,9 +4501,9 @@
       <w14:ligatures w14:val="none"/>
     </w:rPr>
   </w:style>
-  <w:style w:type="character" w:styleId="Hipervnculo">
+  <w:style w:type="character" w:styleId="Hyperlink">
     <w:name w:val="Hyperlink"/>
-    <w:basedOn w:val="Fuentedeprrafopredeter"/>
+    <w:basedOn w:val="DefaultParagraphFont"/>
     <w:uiPriority w:val="99"/>
     <w:unhideWhenUsed/>
     <w:rsid w:val="00D24531"/>
@@ -3893,9 +4512,9 @@
       <w:u w:val="single"/>
     </w:rPr>
   </w:style>
-  <w:style w:type="character" w:styleId="Mencinsinresolver">
+  <w:style w:type="character" w:styleId="UnresolvedMention">
     <w:name w:val="Unresolved Mention"/>
-    <w:basedOn w:val="Fuentedeprrafopredeter"/>
+    <w:basedOn w:val="DefaultParagraphFont"/>
     <w:uiPriority w:val="99"/>
     <w:semiHidden/>
     <w:unhideWhenUsed/>
@@ -3905,9 +4524,9 @@
       <w:shd w:val="clear" w:color="auto" w:fill="E1DFDD"/>
     </w:rPr>
   </w:style>
-  <w:style w:type="character" w:styleId="Fuerte">
+  <w:style w:type="character" w:styleId="Strong">
     <w:name w:val="Strong"/>
-    <w:basedOn w:val="Fuentedeprrafopredeter"/>
+    <w:basedOn w:val="DefaultParagraphFont"/>
     <w:uiPriority w:val="22"/>
     <w:qFormat/>
     <w:rsid w:val="00EC235B"/>

</xml_diff>